<commit_message>
finished with question 3
I did the question 3 part of the assignment along with choosing a tech stack
</commit_message>
<xml_diff>
--- a/SEN381_Assignment1_2026_Group-I.docx
+++ b/SEN381_Assignment1_2026_Group-I.docx
@@ -10,7 +10,6 @@
           <w:docPartUnique/>
         </w:docPartObj>
       </w:sdtPr>
-      <w:sdtEndPr/>
       <w:sdtContent>
         <w:p/>
         <w:p>
@@ -95,7 +94,6 @@
                                     <w:dataBinding w:prefixMappings="xmlns:ns0='http://purl.org/dc/elements/1.1/' xmlns:ns1='http://schemas.openxmlformats.org/package/2006/metadata/core-properties' " w:xpath="/ns1:coreProperties[1]/ns0:title[1]" w:storeItemID="{6C3C8BC8-F283-45AE-878A-BAB7291924A1}"/>
                                     <w:text/>
                                   </w:sdtPr>
-                                  <w:sdtEndPr/>
                                   <w:sdtContent>
                                     <w:r>
                                       <w:rPr>
@@ -122,7 +120,6 @@
                                   <w:dataBinding w:prefixMappings="xmlns:ns0='http://purl.org/dc/elements/1.1/' xmlns:ns1='http://schemas.openxmlformats.org/package/2006/metadata/core-properties' " w:xpath="/ns1:coreProperties[1]/ns0:subject[1]" w:storeItemID="{6C3C8BC8-F283-45AE-878A-BAB7291924A1}"/>
                                   <w:text/>
                                 </w:sdtPr>
-                                <w:sdtEndPr/>
                                 <w:sdtContent>
                                   <w:p>
                                     <w:pPr>
@@ -161,7 +158,6 @@
                                   <w:dataBinding w:prefixMappings="xmlns:ns0='http://purl.org/dc/elements/1.1/' xmlns:ns1='http://schemas.openxmlformats.org/package/2006/metadata/core-properties' " w:xpath="/ns1:coreProperties[1]/ns0:creator[1]" w:storeItemID="{6C3C8BC8-F283-45AE-878A-BAB7291924A1}"/>
                                   <w:text/>
                                 </w:sdtPr>
-                                <w:sdtEndPr/>
                                 <w:sdtContent>
                                   <w:p>
                                     <w:pPr>
@@ -257,7 +253,6 @@
                               <w:dataBinding w:prefixMappings="xmlns:ns0='http://purl.org/dc/elements/1.1/' xmlns:ns1='http://schemas.openxmlformats.org/package/2006/metadata/core-properties' " w:xpath="/ns1:coreProperties[1]/ns0:title[1]" w:storeItemID="{6C3C8BC8-F283-45AE-878A-BAB7291924A1}"/>
                               <w:text/>
                             </w:sdtPr>
-                            <w:sdtEndPr/>
                             <w:sdtContent>
                               <w:r>
                                 <w:rPr>
@@ -284,7 +279,6 @@
                             <w:dataBinding w:prefixMappings="xmlns:ns0='http://purl.org/dc/elements/1.1/' xmlns:ns1='http://schemas.openxmlformats.org/package/2006/metadata/core-properties' " w:xpath="/ns1:coreProperties[1]/ns0:subject[1]" w:storeItemID="{6C3C8BC8-F283-45AE-878A-BAB7291924A1}"/>
                             <w:text/>
                           </w:sdtPr>
-                          <w:sdtEndPr/>
                           <w:sdtContent>
                             <w:p>
                               <w:pPr>
@@ -323,7 +317,6 @@
                             <w:dataBinding w:prefixMappings="xmlns:ns0='http://purl.org/dc/elements/1.1/' xmlns:ns1='http://schemas.openxmlformats.org/package/2006/metadata/core-properties' " w:xpath="/ns1:coreProperties[1]/ns0:creator[1]" w:storeItemID="{6C3C8BC8-F283-45AE-878A-BAB7291924A1}"/>
                             <w:text/>
                           </w:sdtPr>
-                          <w:sdtEndPr/>
                           <w:sdtContent>
                             <w:p>
                               <w:pPr>
@@ -460,7 +453,6 @@
                                     <w:calendar w:val="gregorian"/>
                                   </w:date>
                                 </w:sdtPr>
-                                <w:sdtEndPr/>
                                 <w:sdtContent>
                                   <w:p>
                                     <w:pPr>
@@ -528,7 +520,6 @@
                               <w:calendar w:val="gregorian"/>
                             </w:date>
                           </w:sdtPr>
-                          <w:sdtEndPr/>
                           <w:sdtContent>
                             <w:p>
                               <w:pPr>
@@ -2073,7 +2064,11 @@
         <w:t xml:space="preserve">external databases. On launch day massive traffic </w:t>
       </w:r>
       <w:r>
-        <w:t xml:space="preserve">choked the mandatory authentication gateway, causing cascading system-wide </w:t>
+        <w:t>choked the mandatory authentication gateway, causing cascading system-</w:t>
+      </w:r>
+      <w:r>
+        <w:lastRenderedPageBreak/>
+        <w:t xml:space="preserve">wide </w:t>
       </w:r>
       <w:r>
         <w:t xml:space="preserve">timeouts and crashing for over </w:t>
@@ -2109,13 +2104,1591 @@
       </w:r>
       <w:bookmarkEnd w:id="2"/>
     </w:p>
-    <w:p/>
+    <w:p>
+      <w:r>
+        <w:t>This comparison is between 2 differing approaches for building</w:t>
+      </w:r>
+      <w:r>
+        <w:t xml:space="preserve"> a</w:t>
+      </w:r>
+      <w:r>
+        <w:t xml:space="preserve"> modern web-based application.</w:t>
+      </w:r>
+    </w:p>
+    <w:p>
+      <w:pPr>
+        <w:pStyle w:val="Heading2"/>
+      </w:pPr>
+      <w:r>
+        <w:t>Technology stack options:</w:t>
+      </w:r>
+    </w:p>
+    <w:p>
+      <w:pPr>
+        <w:pStyle w:val="ListParagraph"/>
+        <w:numPr>
+          <w:ilvl w:val="0"/>
+          <w:numId w:val="2"/>
+        </w:numPr>
+      </w:pPr>
+      <w:r>
+        <w:t>TypeScript stack</w:t>
+      </w:r>
+      <w:r>
+        <w:t xml:space="preserve"> (React, NestJS, Node.js, PostgreSQL)</w:t>
+      </w:r>
+      <w:r>
+        <w:t xml:space="preserve">: This uses react for user interface and frontend in general, with </w:t>
+      </w:r>
+      <w:r>
+        <w:t>NestJS/Node.js for the backend. It allows for end-to-end TypeScript with a structured and modular buildout.</w:t>
+      </w:r>
+    </w:p>
+    <w:p>
+      <w:pPr>
+        <w:pStyle w:val="ListParagraph"/>
+        <w:numPr>
+          <w:ilvl w:val="0"/>
+          <w:numId w:val="2"/>
+        </w:numPr>
+      </w:pPr>
+      <w:r>
+        <w:t>Java stack</w:t>
+      </w:r>
+      <w:r>
+        <w:t xml:space="preserve"> (html, CSS, Java, JavaScript)</w:t>
+      </w:r>
+      <w:r>
+        <w:t>: Using Java API</w:t>
+      </w:r>
+      <w:r>
+        <w:t>/Spring boot</w:t>
+      </w:r>
+      <w:r>
+        <w:t xml:space="preserve"> with base html, CSS and JavaScript</w:t>
+      </w:r>
+      <w:r>
+        <w:t>, this approach provides a Java server ecosystem with production-orientated conventions and tooling.</w:t>
+      </w:r>
+    </w:p>
+    <w:p>
+      <w:r>
+        <w:t>PostgreSQL will be use</w:t>
+      </w:r>
+      <w:r>
+        <w:t>d</w:t>
+      </w:r>
+      <w:r>
+        <w:t xml:space="preserve"> for both approaches in terms of database buildout, because it offers the best developer</w:t>
+      </w:r>
+      <w:r>
+        <w:t xml:space="preserve"> and community</w:t>
+      </w:r>
+      <w:r>
+        <w:t xml:space="preserve"> support</w:t>
+      </w:r>
+      <w:r>
+        <w:t>, making it easier to getsulotions for specific problems and many tutorials for help implementing features</w:t>
+      </w:r>
+      <w:r>
+        <w:t>.</w:t>
+      </w:r>
+    </w:p>
+    <w:p>
+      <w:pPr>
+        <w:pStyle w:val="Heading2"/>
+      </w:pPr>
+      <w:r>
+        <w:t>Lifecycle comparison</w:t>
+      </w:r>
+    </w:p>
+    <w:tbl>
+      <w:tblPr>
+        <w:tblStyle w:val="TableGrid"/>
+        <w:tblW w:w="0" w:type="auto"/>
+        <w:tblLook w:val="04A0" w:firstRow="1" w:lastRow="0" w:firstColumn="1" w:lastColumn="0" w:noHBand="0" w:noVBand="1"/>
+      </w:tblPr>
+      <w:tblGrid>
+        <w:gridCol w:w="3005"/>
+        <w:gridCol w:w="3005"/>
+        <w:gridCol w:w="3006"/>
+      </w:tblGrid>
+      <w:tr>
+        <w:tc>
+          <w:tcPr>
+            <w:tcW w:w="3005" w:type="dxa"/>
+            <w:shd w:val="clear" w:color="auto" w:fill="C5D3FF"/>
+          </w:tcPr>
+          <w:p>
+            <w:r>
+              <w:t>Criteria</w:t>
+            </w:r>
+          </w:p>
+        </w:tc>
+        <w:tc>
+          <w:tcPr>
+            <w:tcW w:w="3005" w:type="dxa"/>
+            <w:shd w:val="clear" w:color="auto" w:fill="C5D3FF"/>
+          </w:tcPr>
+          <w:p>
+            <w:r>
+              <w:t>TypeScript stack</w:t>
+            </w:r>
+          </w:p>
+        </w:tc>
+        <w:tc>
+          <w:tcPr>
+            <w:tcW w:w="3006" w:type="dxa"/>
+            <w:shd w:val="clear" w:color="auto" w:fill="C5D3FF"/>
+          </w:tcPr>
+          <w:p>
+            <w:r>
+              <w:t>Java stack</w:t>
+            </w:r>
+          </w:p>
+        </w:tc>
+      </w:tr>
+      <w:tr>
+        <w:tc>
+          <w:tcPr>
+            <w:tcW w:w="3005" w:type="dxa"/>
+          </w:tcPr>
+          <w:p>
+            <w:r>
+              <w:t>Team capability and learning curve</w:t>
+            </w:r>
+          </w:p>
+        </w:tc>
+        <w:tc>
+          <w:tcPr>
+            <w:tcW w:w="3005" w:type="dxa"/>
+          </w:tcPr>
+          <w:p>
+            <w:r>
+              <w:t>One TypeScript language across client and server reduces context switching. NestJS supplies a modular structure, but its Node package ecosystem still require</w:t>
+            </w:r>
+            <w:r>
+              <w:t>s some research</w:t>
+            </w:r>
+            <w:r>
+              <w:t>.</w:t>
+            </w:r>
+          </w:p>
+        </w:tc>
+        <w:tc>
+          <w:tcPr>
+            <w:tcW w:w="3006" w:type="dxa"/>
+          </w:tcPr>
+          <w:p>
+            <w:r>
+              <w:t>Java</w:t>
+            </w:r>
+            <w:r>
+              <w:t xml:space="preserve"> tech stack</w:t>
+            </w:r>
+            <w:r>
+              <w:t xml:space="preserve"> requires competence in two languages and</w:t>
+            </w:r>
+            <w:r>
+              <w:t xml:space="preserve"> readability of code may prove to be difficult as the project grows</w:t>
+            </w:r>
+            <w:r>
+              <w:t>. The initial learning curve is higher.</w:t>
+            </w:r>
+          </w:p>
+        </w:tc>
+      </w:tr>
+      <w:tr>
+        <w:tc>
+          <w:tcPr>
+            <w:tcW w:w="3005" w:type="dxa"/>
+          </w:tcPr>
+          <w:p>
+            <w:r>
+              <w:lastRenderedPageBreak/>
+              <w:t>Security</w:t>
+            </w:r>
+            <w:r>
+              <w:t xml:space="preserve"> ecosystem</w:t>
+            </w:r>
+          </w:p>
+        </w:tc>
+        <w:tc>
+          <w:tcPr>
+            <w:tcW w:w="3005" w:type="dxa"/>
+          </w:tcPr>
+          <w:p>
+            <w:r>
+              <w:t xml:space="preserve">Guards, validation, authentication packages and Node security practices are </w:t>
+            </w:r>
+            <w:r>
+              <w:t xml:space="preserve">readily </w:t>
+            </w:r>
+            <w:r>
+              <w:t>available</w:t>
+            </w:r>
+            <w:r>
+              <w:t>.</w:t>
+            </w:r>
+          </w:p>
+        </w:tc>
+        <w:tc>
+          <w:tcPr>
+            <w:tcW w:w="3006" w:type="dxa"/>
+          </w:tcPr>
+          <w:p>
+            <w:r>
+              <w:t xml:space="preserve">Spring Boot </w:t>
+            </w:r>
+            <w:r>
+              <w:t xml:space="preserve">makes use of the </w:t>
+            </w:r>
+            <w:r>
+              <w:t xml:space="preserve">broad Spring Security ecosystem and provides common security-related production features </w:t>
+            </w:r>
+            <w:sdt>
+              <w:sdtPr>
+                <w:id w:val="-2050982530"/>
+                <w:citation/>
+              </w:sdtPr>
+              <w:sdtContent>
+                <w:r>
+                  <w:fldChar w:fldCharType="begin"/>
+                </w:r>
+                <w:r>
+                  <w:rPr>
+                    <w:lang w:val="en-US"/>
+                  </w:rPr>
+                  <w:instrText xml:space="preserve"> CITATION Spr26 \l 1033 </w:instrText>
+                </w:r>
+                <w:r>
+                  <w:fldChar w:fldCharType="separate"/>
+                </w:r>
+                <w:r>
+                  <w:rPr>
+                    <w:noProof/>
+                    <w:lang w:val="en-US"/>
+                  </w:rPr>
+                  <w:t>(Spring, 2026)</w:t>
+                </w:r>
+                <w:r>
+                  <w:fldChar w:fldCharType="end"/>
+                </w:r>
+              </w:sdtContent>
+            </w:sdt>
+            <w:r>
+              <w:t>.</w:t>
+            </w:r>
+          </w:p>
+        </w:tc>
+      </w:tr>
+      <w:tr>
+        <w:tc>
+          <w:tcPr>
+            <w:tcW w:w="3005" w:type="dxa"/>
+          </w:tcPr>
+          <w:p>
+            <w:r>
+              <w:t>Maintainability</w:t>
+            </w:r>
+          </w:p>
+        </w:tc>
+        <w:tc>
+          <w:tcPr>
+            <w:tcW w:w="3005" w:type="dxa"/>
+          </w:tcPr>
+          <w:p>
+            <w:r>
+              <w:t>NestJS promotes modular, loosely coupled and testable applications</w:t>
+            </w:r>
+            <w:r>
+              <w:t xml:space="preserve">. </w:t>
+            </w:r>
+            <w:r>
+              <w:t>This</w:t>
+            </w:r>
+            <w:r>
+              <w:t xml:space="preserve"> makes </w:t>
+            </w:r>
+            <w:r>
+              <w:t>later bug fixing</w:t>
+            </w:r>
+            <w:r>
+              <w:t xml:space="preserve"> easier</w:t>
+            </w:r>
+            <w:r>
+              <w:t xml:space="preserve"> </w:t>
+            </w:r>
+            <w:sdt>
+              <w:sdtPr>
+                <w:id w:val="1791781642"/>
+                <w:citation/>
+              </w:sdtPr>
+              <w:sdtContent>
+                <w:r>
+                  <w:fldChar w:fldCharType="begin"/>
+                </w:r>
+                <w:r>
+                  <w:rPr>
+                    <w:lang w:val="en-US"/>
+                  </w:rPr>
+                  <w:instrText xml:space="preserve"> CITATION Nes26 \l 1033 </w:instrText>
+                </w:r>
+                <w:r>
+                  <w:fldChar w:fldCharType="separate"/>
+                </w:r>
+                <w:r>
+                  <w:rPr>
+                    <w:noProof/>
+                    <w:lang w:val="en-US"/>
+                  </w:rPr>
+                  <w:t>(NestJS, 2026)</w:t>
+                </w:r>
+                <w:r>
+                  <w:fldChar w:fldCharType="end"/>
+                </w:r>
+              </w:sdtContent>
+            </w:sdt>
+            <w:r>
+              <w:t>.</w:t>
+            </w:r>
+          </w:p>
+        </w:tc>
+        <w:tc>
+          <w:tcPr>
+            <w:tcW w:w="3006" w:type="dxa"/>
+          </w:tcPr>
+          <w:p>
+            <w:r>
+              <w:t>It</w:t>
+            </w:r>
+            <w:r>
+              <w:t xml:space="preserve"> support</w:t>
+            </w:r>
+            <w:r>
+              <w:t>s</w:t>
+            </w:r>
+            <w:r>
+              <w:t xml:space="preserve"> long-lived systems, but excessive framework complexity can increase maintenance </w:t>
+            </w:r>
+            <w:r>
+              <w:t>cost</w:t>
+            </w:r>
+            <w:r>
+              <w:t xml:space="preserve"> </w:t>
+            </w:r>
+            <w:sdt>
+              <w:sdtPr>
+                <w:id w:val="85583976"/>
+                <w:citation/>
+              </w:sdtPr>
+              <w:sdtContent>
+                <w:r>
+                  <w:fldChar w:fldCharType="begin"/>
+                </w:r>
+                <w:r>
+                  <w:rPr>
+                    <w:lang w:val="en-US"/>
+                  </w:rPr>
+                  <w:instrText xml:space="preserve"> CITATION Spr26 \l 1033 </w:instrText>
+                </w:r>
+                <w:r>
+                  <w:fldChar w:fldCharType="separate"/>
+                </w:r>
+                <w:r>
+                  <w:rPr>
+                    <w:noProof/>
+                    <w:lang w:val="en-US"/>
+                  </w:rPr>
+                  <w:t>(Spring, 2026)</w:t>
+                </w:r>
+                <w:r>
+                  <w:fldChar w:fldCharType="end"/>
+                </w:r>
+              </w:sdtContent>
+            </w:sdt>
+            <w:r>
+              <w:t>.</w:t>
+            </w:r>
+          </w:p>
+        </w:tc>
+      </w:tr>
+      <w:tr>
+        <w:tc>
+          <w:tcPr>
+            <w:tcW w:w="3005" w:type="dxa"/>
+          </w:tcPr>
+          <w:p>
+            <w:r>
+              <w:t>Testing and tooling support</w:t>
+            </w:r>
+          </w:p>
+        </w:tc>
+        <w:tc>
+          <w:tcPr>
+            <w:tcW w:w="3005" w:type="dxa"/>
+          </w:tcPr>
+          <w:p>
+            <w:r>
+              <w:t xml:space="preserve">Modular design support makes testing easier. </w:t>
+            </w:r>
+            <w:r>
+              <w:t xml:space="preserve">JavaScript/TypeScript tooling is extensive </w:t>
+            </w:r>
+            <w:sdt>
+              <w:sdtPr>
+                <w:id w:val="-925338458"/>
+                <w:citation/>
+              </w:sdtPr>
+              <w:sdtContent>
+                <w:r>
+                  <w:fldChar w:fldCharType="begin"/>
+                </w:r>
+                <w:r>
+                  <w:rPr>
+                    <w:lang w:val="en-US"/>
+                  </w:rPr>
+                  <w:instrText xml:space="preserve"> CITATION Nes26 \l 1033 </w:instrText>
+                </w:r>
+                <w:r>
+                  <w:fldChar w:fldCharType="separate"/>
+                </w:r>
+                <w:r>
+                  <w:rPr>
+                    <w:noProof/>
+                    <w:lang w:val="en-US"/>
+                  </w:rPr>
+                  <w:t>(NestJS, 2026)</w:t>
+                </w:r>
+                <w:r>
+                  <w:fldChar w:fldCharType="end"/>
+                </w:r>
+              </w:sdtContent>
+            </w:sdt>
+            <w:r>
+              <w:t>.</w:t>
+            </w:r>
+          </w:p>
+        </w:tc>
+        <w:tc>
+          <w:tcPr>
+            <w:tcW w:w="3006" w:type="dxa"/>
+          </w:tcPr>
+          <w:p>
+            <w:r>
+              <w:t>Mature Java build and Spring testing support</w:t>
+            </w:r>
+            <w:r>
+              <w:t>s</w:t>
+            </w:r>
+            <w:r>
+              <w:t xml:space="preserve"> enterprise development. </w:t>
+            </w:r>
+            <w:r>
+              <w:t>Costly</w:t>
+            </w:r>
+            <w:r>
+              <w:t xml:space="preserve"> configuration and slower feedback may occur in </w:t>
+            </w:r>
+            <w:r>
+              <w:t>larger</w:t>
+            </w:r>
+            <w:r>
+              <w:t xml:space="preserve"> projects.</w:t>
+            </w:r>
+          </w:p>
+        </w:tc>
+      </w:tr>
+      <w:tr>
+        <w:tc>
+          <w:tcPr>
+            <w:tcW w:w="3005" w:type="dxa"/>
+          </w:tcPr>
+          <w:p>
+            <w:r>
+              <w:t>Deployment/platform compatibility</w:t>
+            </w:r>
+          </w:p>
+        </w:tc>
+        <w:tc>
+          <w:tcPr>
+            <w:tcW w:w="3005" w:type="dxa"/>
+          </w:tcPr>
+          <w:p>
+            <w:r>
+              <w:t xml:space="preserve">Runs wherever a supported Node.js runtime </w:t>
+            </w:r>
+            <w:r>
+              <w:t>environment</w:t>
+            </w:r>
+            <w:r>
+              <w:t xml:space="preserve"> is available. A simple</w:t>
+            </w:r>
+            <w:r>
+              <w:t>r</w:t>
+            </w:r>
+            <w:r>
+              <w:t xml:space="preserve"> build pipeline is </w:t>
+            </w:r>
+            <w:r>
+              <w:t>better</w:t>
+            </w:r>
+            <w:r>
+              <w:t xml:space="preserve"> for many </w:t>
+            </w:r>
+            <w:r>
+              <w:t>web</w:t>
+            </w:r>
+            <w:r>
+              <w:t xml:space="preserve"> </w:t>
+            </w:r>
+            <w:r>
+              <w:t>applications</w:t>
+            </w:r>
+            <w:r>
+              <w:t>.</w:t>
+            </w:r>
+          </w:p>
+        </w:tc>
+        <w:tc>
+          <w:tcPr>
+            <w:tcW w:w="3006" w:type="dxa"/>
+          </w:tcPr>
+          <w:p>
+            <w:r>
+              <w:t>Runs as a stand-alone JAR</w:t>
+            </w:r>
+            <w:r>
+              <w:t xml:space="preserve"> or</w:t>
+            </w:r>
+            <w:r>
+              <w:t xml:space="preserve"> a container. JVM availability is broad, </w:t>
+            </w:r>
+            <w:r>
+              <w:t>but</w:t>
+            </w:r>
+            <w:r>
+              <w:t xml:space="preserve"> resource requirements can be </w:t>
+            </w:r>
+            <w:r>
+              <w:t>costly</w:t>
+            </w:r>
+            <w:r>
+              <w:t xml:space="preserve"> </w:t>
+            </w:r>
+            <w:sdt>
+              <w:sdtPr>
+                <w:id w:val="71164170"/>
+                <w:citation/>
+              </w:sdtPr>
+              <w:sdtContent>
+                <w:r>
+                  <w:fldChar w:fldCharType="begin"/>
+                </w:r>
+                <w:r>
+                  <w:rPr>
+                    <w:lang w:val="en-US"/>
+                  </w:rPr>
+                  <w:instrText xml:space="preserve"> CITATION Spr26 \l 1033 </w:instrText>
+                </w:r>
+                <w:r>
+                  <w:fldChar w:fldCharType="separate"/>
+                </w:r>
+                <w:r>
+                  <w:rPr>
+                    <w:noProof/>
+                    <w:lang w:val="en-US"/>
+                  </w:rPr>
+                  <w:t>(Spring, 2026)</w:t>
+                </w:r>
+                <w:r>
+                  <w:fldChar w:fldCharType="end"/>
+                </w:r>
+              </w:sdtContent>
+            </w:sdt>
+            <w:r>
+              <w:t>.</w:t>
+            </w:r>
+          </w:p>
+        </w:tc>
+      </w:tr>
+      <w:tr>
+        <w:tc>
+          <w:tcPr>
+            <w:tcW w:w="3005" w:type="dxa"/>
+          </w:tcPr>
+          <w:p>
+            <w:r>
+              <w:t>Development and operational cost</w:t>
+            </w:r>
+          </w:p>
+        </w:tc>
+        <w:tc>
+          <w:tcPr>
+            <w:tcW w:w="3005" w:type="dxa"/>
+          </w:tcPr>
+          <w:p>
+            <w:r>
+              <w:t xml:space="preserve">Open-source components </w:t>
+            </w:r>
+            <w:r>
+              <w:t xml:space="preserve">and community support </w:t>
+            </w:r>
+            <w:r>
+              <w:t>reduce</w:t>
+            </w:r>
+            <w:r>
+              <w:t xml:space="preserve"> research</w:t>
+            </w:r>
+            <w:r>
+              <w:t xml:space="preserve"> overhead. </w:t>
+            </w:r>
+            <w:r>
+              <w:t>H</w:t>
+            </w:r>
+            <w:r>
+              <w:t>osting cost depends on workload</w:t>
+            </w:r>
+            <w:r>
+              <w:t xml:space="preserve"> </w:t>
+            </w:r>
+            <w:r>
+              <w:t>and service choices.</w:t>
+            </w:r>
+          </w:p>
+        </w:tc>
+        <w:tc>
+          <w:tcPr>
+            <w:tcW w:w="3006" w:type="dxa"/>
+          </w:tcPr>
+          <w:p>
+            <w:r>
+              <w:t>Open-source components avoid licence fees, but specialist Java skills and potentially higher compute use can</w:t>
+            </w:r>
+            <w:r>
+              <w:t xml:space="preserve"> greatly</w:t>
+            </w:r>
+            <w:r>
+              <w:t xml:space="preserve"> increase cost.</w:t>
+            </w:r>
+          </w:p>
+        </w:tc>
+      </w:tr>
+      <w:tr>
+        <w:tc>
+          <w:tcPr>
+            <w:tcW w:w="3005" w:type="dxa"/>
+          </w:tcPr>
+          <w:p>
+            <w:r>
+              <w:lastRenderedPageBreak/>
+              <w:t>Future change implications</w:t>
+            </w:r>
+          </w:p>
+        </w:tc>
+        <w:tc>
+          <w:tcPr>
+            <w:tcW w:w="3005" w:type="dxa"/>
+          </w:tcPr>
+          <w:p>
+            <w:r>
+              <w:t xml:space="preserve">Modularity and shared types </w:t>
+            </w:r>
+            <w:r>
+              <w:t>allow for fast</w:t>
+            </w:r>
+            <w:r>
+              <w:t xml:space="preserve"> feature change. </w:t>
+            </w:r>
+            <w:r>
+              <w:t>P</w:t>
+            </w:r>
+            <w:r>
+              <w:t>ackage upgrades must be actively</w:t>
+            </w:r>
+            <w:r>
+              <w:t xml:space="preserve"> and closely</w:t>
+            </w:r>
+            <w:r>
+              <w:t xml:space="preserve"> </w:t>
+            </w:r>
+            <w:r>
+              <w:t>monitored.</w:t>
+            </w:r>
+          </w:p>
+        </w:tc>
+        <w:tc>
+          <w:tcPr>
+            <w:tcW w:w="3006" w:type="dxa"/>
+          </w:tcPr>
+          <w:p>
+            <w:r>
+              <w:t>Has s</w:t>
+            </w:r>
+            <w:r>
+              <w:t>trong convention</w:t>
+            </w:r>
+            <w:r>
+              <w:t>s</w:t>
+            </w:r>
+            <w:r>
+              <w:t>. Major framework/JDK upgrades and integration complexity still require</w:t>
+            </w:r>
+            <w:r>
+              <w:t xml:space="preserve"> extensive</w:t>
+            </w:r>
+            <w:r>
+              <w:t xml:space="preserve"> </w:t>
+            </w:r>
+            <w:r>
+              <w:t>pre-</w:t>
+            </w:r>
+            <w:r>
+              <w:t>planning.</w:t>
+            </w:r>
+          </w:p>
+        </w:tc>
+      </w:tr>
+    </w:tbl>
+    <w:p>
+      <w:pPr>
+        <w:pStyle w:val="Heading2"/>
+      </w:pPr>
+      <w:r>
+        <w:t>Weight justification</w:t>
+      </w:r>
+    </w:p>
+    <w:p>
+      <w:r>
+        <w:t>A general public-facing information system is reflected in weights. Due to the potential for user harm and deployment constraints, security is given the highest weight (20%). Because they have a significant impact on delivery risk and overall lifecycle effort, team capability, maintainability, testing/tooling, and future change each receive 15%. Although both open-source stacks are widely deployable and their actual prices depend on workload, hosting, service levels, and the team, deployment compatibility and cost both receive 10%.</w:t>
+      </w:r>
+    </w:p>
+    <w:p>
+      <w:pPr>
+        <w:pStyle w:val="Heading2"/>
+      </w:pPr>
+      <w:r>
+        <w:t>Weighted decision matrix</w:t>
+      </w:r>
+    </w:p>
+    <w:p>
+      <w:r>
+        <w:t>Scoring scale in terms of fit: 1 = poor, 2 = decent, 3 = strong fit.</w:t>
+      </w:r>
+    </w:p>
+    <w:p>
+      <w:r>
+        <w:t xml:space="preserve">% </w:t>
+      </w:r>
+      <w:r>
+        <w:t>Fit</w:t>
+      </w:r>
+      <w:r>
+        <w:t xml:space="preserve"> will be calculated as follows: (</w:t>
+      </w:r>
+      <w:r>
+        <w:t>(</w:t>
+      </w:r>
+      <w:r>
+        <w:t>sum (</w:t>
+      </w:r>
+      <w:r>
+        <w:t xml:space="preserve">weight * score))/total </w:t>
+      </w:r>
+      <w:r>
+        <w:t>possible) *</w:t>
+      </w:r>
+      <w:r>
+        <w:t>100</w:t>
+      </w:r>
+    </w:p>
+    <w:p>
+      <w:r>
+        <w:t>Typescript stack: A</w:t>
+      </w:r>
+    </w:p>
+    <w:p>
+      <w:r>
+        <w:t>Java stack: B</w:t>
+      </w:r>
+    </w:p>
+    <w:tbl>
+      <w:tblPr>
+        <w:tblStyle w:val="TableGrid"/>
+        <w:tblW w:w="0" w:type="auto"/>
+        <w:tblLook w:val="04A0" w:firstRow="1" w:lastRow="0" w:firstColumn="1" w:lastColumn="0" w:noHBand="0" w:noVBand="1"/>
+      </w:tblPr>
+      <w:tblGrid>
+        <w:gridCol w:w="2296"/>
+        <w:gridCol w:w="1316"/>
+        <w:gridCol w:w="1294"/>
+        <w:gridCol w:w="1408"/>
+        <w:gridCol w:w="1294"/>
+        <w:gridCol w:w="1408"/>
+      </w:tblGrid>
+      <w:tr>
+        <w:tc>
+          <w:tcPr>
+            <w:tcW w:w="2296" w:type="dxa"/>
+            <w:shd w:val="clear" w:color="auto" w:fill="C5D3FF"/>
+          </w:tcPr>
+          <w:p>
+            <w:r>
+              <w:t>Criteria</w:t>
+            </w:r>
+          </w:p>
+        </w:tc>
+        <w:tc>
+          <w:tcPr>
+            <w:tcW w:w="1316" w:type="dxa"/>
+            <w:shd w:val="clear" w:color="auto" w:fill="C5D3FF"/>
+          </w:tcPr>
+          <w:p>
+            <w:r>
+              <w:t>Weight %</w:t>
+            </w:r>
+          </w:p>
+        </w:tc>
+        <w:tc>
+          <w:tcPr>
+            <w:tcW w:w="1294" w:type="dxa"/>
+            <w:shd w:val="clear" w:color="auto" w:fill="C5D3FF"/>
+          </w:tcPr>
+          <w:p>
+            <w:r>
+              <w:t>Score: A</w:t>
+            </w:r>
+          </w:p>
+        </w:tc>
+        <w:tc>
+          <w:tcPr>
+            <w:tcW w:w="1408" w:type="dxa"/>
+            <w:shd w:val="clear" w:color="auto" w:fill="C5D3FF"/>
+          </w:tcPr>
+          <w:p>
+            <w:r>
+              <w:t>Weigh</w:t>
+            </w:r>
+            <w:r>
+              <w:t>t * score</w:t>
+            </w:r>
+            <w:r>
+              <w:t>: A</w:t>
+            </w:r>
+          </w:p>
+        </w:tc>
+        <w:tc>
+          <w:tcPr>
+            <w:tcW w:w="1294" w:type="dxa"/>
+            <w:shd w:val="clear" w:color="auto" w:fill="C5D3FF"/>
+          </w:tcPr>
+          <w:p>
+            <w:r>
+              <w:t>Score: B</w:t>
+            </w:r>
+          </w:p>
+        </w:tc>
+        <w:tc>
+          <w:tcPr>
+            <w:tcW w:w="1408" w:type="dxa"/>
+            <w:shd w:val="clear" w:color="auto" w:fill="C5D3FF"/>
+          </w:tcPr>
+          <w:p>
+            <w:r>
+              <w:t>Weig</w:t>
+            </w:r>
+            <w:r>
+              <w:t>ht * score</w:t>
+            </w:r>
+            <w:r>
+              <w:t>: B</w:t>
+            </w:r>
+          </w:p>
+        </w:tc>
+      </w:tr>
+      <w:tr>
+        <w:tc>
+          <w:tcPr>
+            <w:tcW w:w="2296" w:type="dxa"/>
+          </w:tcPr>
+          <w:p>
+            <w:r>
+              <w:t>Team capability and learning curve</w:t>
+            </w:r>
+          </w:p>
+        </w:tc>
+        <w:tc>
+          <w:tcPr>
+            <w:tcW w:w="1316" w:type="dxa"/>
+          </w:tcPr>
+          <w:p>
+            <w:r>
+              <w:t>15</w:t>
+            </w:r>
+          </w:p>
+        </w:tc>
+        <w:tc>
+          <w:tcPr>
+            <w:tcW w:w="1294" w:type="dxa"/>
+          </w:tcPr>
+          <w:p>
+            <w:r>
+              <w:t>3</w:t>
+            </w:r>
+          </w:p>
+        </w:tc>
+        <w:tc>
+          <w:tcPr>
+            <w:tcW w:w="1408" w:type="dxa"/>
+          </w:tcPr>
+          <w:p>
+            <w:r>
+              <w:t>45</w:t>
+            </w:r>
+          </w:p>
+        </w:tc>
+        <w:tc>
+          <w:tcPr>
+            <w:tcW w:w="1294" w:type="dxa"/>
+          </w:tcPr>
+          <w:p>
+            <w:r>
+              <w:t>2</w:t>
+            </w:r>
+          </w:p>
+        </w:tc>
+        <w:tc>
+          <w:tcPr>
+            <w:tcW w:w="1408" w:type="dxa"/>
+          </w:tcPr>
+          <w:p>
+            <w:r>
+              <w:t>30</w:t>
+            </w:r>
+          </w:p>
+        </w:tc>
+      </w:tr>
+      <w:tr>
+        <w:tc>
+          <w:tcPr>
+            <w:tcW w:w="2296" w:type="dxa"/>
+          </w:tcPr>
+          <w:p>
+            <w:r>
+              <w:t>Security ecosystem</w:t>
+            </w:r>
+          </w:p>
+        </w:tc>
+        <w:tc>
+          <w:tcPr>
+            <w:tcW w:w="1316" w:type="dxa"/>
+          </w:tcPr>
+          <w:p>
+            <w:r>
+              <w:t>20</w:t>
+            </w:r>
+          </w:p>
+        </w:tc>
+        <w:tc>
+          <w:tcPr>
+            <w:tcW w:w="1294" w:type="dxa"/>
+          </w:tcPr>
+          <w:p>
+            <w:r>
+              <w:t>2</w:t>
+            </w:r>
+          </w:p>
+        </w:tc>
+        <w:tc>
+          <w:tcPr>
+            <w:tcW w:w="1408" w:type="dxa"/>
+          </w:tcPr>
+          <w:p>
+            <w:r>
+              <w:t>40</w:t>
+            </w:r>
+          </w:p>
+        </w:tc>
+        <w:tc>
+          <w:tcPr>
+            <w:tcW w:w="1294" w:type="dxa"/>
+          </w:tcPr>
+          <w:p>
+            <w:r>
+              <w:t>3</w:t>
+            </w:r>
+          </w:p>
+        </w:tc>
+        <w:tc>
+          <w:tcPr>
+            <w:tcW w:w="1408" w:type="dxa"/>
+          </w:tcPr>
+          <w:p>
+            <w:r>
+              <w:t>60</w:t>
+            </w:r>
+          </w:p>
+        </w:tc>
+      </w:tr>
+      <w:tr>
+        <w:tc>
+          <w:tcPr>
+            <w:tcW w:w="2296" w:type="dxa"/>
+          </w:tcPr>
+          <w:p>
+            <w:r>
+              <w:t>Maintainability</w:t>
+            </w:r>
+          </w:p>
+        </w:tc>
+        <w:tc>
+          <w:tcPr>
+            <w:tcW w:w="1316" w:type="dxa"/>
+          </w:tcPr>
+          <w:p>
+            <w:r>
+              <w:t>15</w:t>
+            </w:r>
+          </w:p>
+        </w:tc>
+        <w:tc>
+          <w:tcPr>
+            <w:tcW w:w="1294" w:type="dxa"/>
+          </w:tcPr>
+          <w:p>
+            <w:r>
+              <w:t>3</w:t>
+            </w:r>
+          </w:p>
+        </w:tc>
+        <w:tc>
+          <w:tcPr>
+            <w:tcW w:w="1408" w:type="dxa"/>
+          </w:tcPr>
+          <w:p>
+            <w:r>
+              <w:t>45</w:t>
+            </w:r>
+          </w:p>
+        </w:tc>
+        <w:tc>
+          <w:tcPr>
+            <w:tcW w:w="1294" w:type="dxa"/>
+          </w:tcPr>
+          <w:p>
+            <w:r>
+              <w:t>3</w:t>
+            </w:r>
+          </w:p>
+        </w:tc>
+        <w:tc>
+          <w:tcPr>
+            <w:tcW w:w="1408" w:type="dxa"/>
+          </w:tcPr>
+          <w:p>
+            <w:r>
+              <w:t>45</w:t>
+            </w:r>
+          </w:p>
+        </w:tc>
+      </w:tr>
+      <w:tr>
+        <w:tc>
+          <w:tcPr>
+            <w:tcW w:w="2296" w:type="dxa"/>
+          </w:tcPr>
+          <w:p>
+            <w:r>
+              <w:t>Testing and tooling support</w:t>
+            </w:r>
+          </w:p>
+        </w:tc>
+        <w:tc>
+          <w:tcPr>
+            <w:tcW w:w="1316" w:type="dxa"/>
+          </w:tcPr>
+          <w:p>
+            <w:r>
+              <w:t>15</w:t>
+            </w:r>
+          </w:p>
+        </w:tc>
+        <w:tc>
+          <w:tcPr>
+            <w:tcW w:w="1294" w:type="dxa"/>
+          </w:tcPr>
+          <w:p>
+            <w:r>
+              <w:t>3</w:t>
+            </w:r>
+          </w:p>
+        </w:tc>
+        <w:tc>
+          <w:tcPr>
+            <w:tcW w:w="1408" w:type="dxa"/>
+          </w:tcPr>
+          <w:p>
+            <w:r>
+              <w:t>45</w:t>
+            </w:r>
+          </w:p>
+        </w:tc>
+        <w:tc>
+          <w:tcPr>
+            <w:tcW w:w="1294" w:type="dxa"/>
+          </w:tcPr>
+          <w:p>
+            <w:r>
+              <w:t>3</w:t>
+            </w:r>
+          </w:p>
+        </w:tc>
+        <w:tc>
+          <w:tcPr>
+            <w:tcW w:w="1408" w:type="dxa"/>
+          </w:tcPr>
+          <w:p>
+            <w:r>
+              <w:t>45</w:t>
+            </w:r>
+          </w:p>
+        </w:tc>
+      </w:tr>
+      <w:tr>
+        <w:tc>
+          <w:tcPr>
+            <w:tcW w:w="2296" w:type="dxa"/>
+          </w:tcPr>
+          <w:p>
+            <w:r>
+              <w:t>Deployment/platform compatibility</w:t>
+            </w:r>
+          </w:p>
+        </w:tc>
+        <w:tc>
+          <w:tcPr>
+            <w:tcW w:w="1316" w:type="dxa"/>
+          </w:tcPr>
+          <w:p>
+            <w:r>
+              <w:t>10</w:t>
+            </w:r>
+          </w:p>
+        </w:tc>
+        <w:tc>
+          <w:tcPr>
+            <w:tcW w:w="1294" w:type="dxa"/>
+          </w:tcPr>
+          <w:p>
+            <w:r>
+              <w:t>3</w:t>
+            </w:r>
+          </w:p>
+        </w:tc>
+        <w:tc>
+          <w:tcPr>
+            <w:tcW w:w="1408" w:type="dxa"/>
+          </w:tcPr>
+          <w:p>
+            <w:r>
+              <w:t>30</w:t>
+            </w:r>
+          </w:p>
+        </w:tc>
+        <w:tc>
+          <w:tcPr>
+            <w:tcW w:w="1294" w:type="dxa"/>
+          </w:tcPr>
+          <w:p>
+            <w:r>
+              <w:t>2</w:t>
+            </w:r>
+          </w:p>
+        </w:tc>
+        <w:tc>
+          <w:tcPr>
+            <w:tcW w:w="1408" w:type="dxa"/>
+          </w:tcPr>
+          <w:p>
+            <w:r>
+              <w:t>20</w:t>
+            </w:r>
+          </w:p>
+        </w:tc>
+      </w:tr>
+      <w:tr>
+        <w:tc>
+          <w:tcPr>
+            <w:tcW w:w="2296" w:type="dxa"/>
+          </w:tcPr>
+          <w:p>
+            <w:r>
+              <w:lastRenderedPageBreak/>
+              <w:t>Development and operational cost</w:t>
+            </w:r>
+          </w:p>
+        </w:tc>
+        <w:tc>
+          <w:tcPr>
+            <w:tcW w:w="1316" w:type="dxa"/>
+          </w:tcPr>
+          <w:p>
+            <w:r>
+              <w:t>10</w:t>
+            </w:r>
+          </w:p>
+        </w:tc>
+        <w:tc>
+          <w:tcPr>
+            <w:tcW w:w="1294" w:type="dxa"/>
+          </w:tcPr>
+          <w:p>
+            <w:r>
+              <w:t>3</w:t>
+            </w:r>
+          </w:p>
+        </w:tc>
+        <w:tc>
+          <w:tcPr>
+            <w:tcW w:w="1408" w:type="dxa"/>
+          </w:tcPr>
+          <w:p>
+            <w:r>
+              <w:t>30</w:t>
+            </w:r>
+          </w:p>
+        </w:tc>
+        <w:tc>
+          <w:tcPr>
+            <w:tcW w:w="1294" w:type="dxa"/>
+          </w:tcPr>
+          <w:p>
+            <w:r>
+              <w:t>2</w:t>
+            </w:r>
+          </w:p>
+        </w:tc>
+        <w:tc>
+          <w:tcPr>
+            <w:tcW w:w="1408" w:type="dxa"/>
+          </w:tcPr>
+          <w:p>
+            <w:r>
+              <w:t>2</w:t>
+            </w:r>
+            <w:r>
+              <w:t>0</w:t>
+            </w:r>
+          </w:p>
+        </w:tc>
+      </w:tr>
+      <w:tr>
+        <w:tc>
+          <w:tcPr>
+            <w:tcW w:w="2296" w:type="dxa"/>
+          </w:tcPr>
+          <w:p>
+            <w:r>
+              <w:t>Future change implications</w:t>
+            </w:r>
+          </w:p>
+        </w:tc>
+        <w:tc>
+          <w:tcPr>
+            <w:tcW w:w="1316" w:type="dxa"/>
+          </w:tcPr>
+          <w:p>
+            <w:r>
+              <w:t>15</w:t>
+            </w:r>
+          </w:p>
+        </w:tc>
+        <w:tc>
+          <w:tcPr>
+            <w:tcW w:w="1294" w:type="dxa"/>
+          </w:tcPr>
+          <w:p>
+            <w:r>
+              <w:t>3</w:t>
+            </w:r>
+          </w:p>
+        </w:tc>
+        <w:tc>
+          <w:tcPr>
+            <w:tcW w:w="1408" w:type="dxa"/>
+          </w:tcPr>
+          <w:p>
+            <w:r>
+              <w:t>45</w:t>
+            </w:r>
+          </w:p>
+        </w:tc>
+        <w:tc>
+          <w:tcPr>
+            <w:tcW w:w="1294" w:type="dxa"/>
+          </w:tcPr>
+          <w:p>
+            <w:r>
+              <w:t>3</w:t>
+            </w:r>
+          </w:p>
+        </w:tc>
+        <w:tc>
+          <w:tcPr>
+            <w:tcW w:w="1408" w:type="dxa"/>
+          </w:tcPr>
+          <w:p>
+            <w:r>
+              <w:t>3</w:t>
+            </w:r>
+            <w:r>
+              <w:t>0</w:t>
+            </w:r>
+          </w:p>
+        </w:tc>
+      </w:tr>
+      <w:tr>
+        <w:tc>
+          <w:tcPr>
+            <w:tcW w:w="2296" w:type="dxa"/>
+          </w:tcPr>
+          <w:p>
+            <w:r>
+              <w:t xml:space="preserve">TOTAL </w:t>
+            </w:r>
+          </w:p>
+        </w:tc>
+        <w:tc>
+          <w:tcPr>
+            <w:tcW w:w="1316" w:type="dxa"/>
+          </w:tcPr>
+          <w:p>
+            <w:r>
+              <w:t>100</w:t>
+            </w:r>
+          </w:p>
+        </w:tc>
+        <w:tc>
+          <w:tcPr>
+            <w:tcW w:w="1294" w:type="dxa"/>
+          </w:tcPr>
+          <w:p>
+            <w:r>
+              <w:t>20</w:t>
+            </w:r>
+          </w:p>
+        </w:tc>
+        <w:tc>
+          <w:tcPr>
+            <w:tcW w:w="1408" w:type="dxa"/>
+          </w:tcPr>
+          <w:p>
+            <w:r>
+              <w:t>280</w:t>
+            </w:r>
+          </w:p>
+        </w:tc>
+        <w:tc>
+          <w:tcPr>
+            <w:tcW w:w="1294" w:type="dxa"/>
+          </w:tcPr>
+          <w:p>
+            <w:r>
+              <w:t>14</w:t>
+            </w:r>
+          </w:p>
+        </w:tc>
+        <w:tc>
+          <w:tcPr>
+            <w:tcW w:w="1408" w:type="dxa"/>
+          </w:tcPr>
+          <w:p>
+            <w:r>
+              <w:t>2</w:t>
+            </w:r>
+            <w:r>
+              <w:t>50</w:t>
+            </w:r>
+          </w:p>
+        </w:tc>
+      </w:tr>
+      <w:tr>
+        <w:tc>
+          <w:tcPr>
+            <w:tcW w:w="2296" w:type="dxa"/>
+          </w:tcPr>
+          <w:p>
+            <w:r>
+              <w:t>% Fit:</w:t>
+            </w:r>
+          </w:p>
+        </w:tc>
+        <w:tc>
+          <w:tcPr>
+            <w:tcW w:w="1316" w:type="dxa"/>
+          </w:tcPr>
+          <w:p>
+            <w:r>
+              <w:t>100</w:t>
+            </w:r>
+          </w:p>
+        </w:tc>
+        <w:tc>
+          <w:tcPr>
+            <w:tcW w:w="1294" w:type="dxa"/>
+          </w:tcPr>
+          <w:p/>
+        </w:tc>
+        <w:tc>
+          <w:tcPr>
+            <w:tcW w:w="1408" w:type="dxa"/>
+          </w:tcPr>
+          <w:p>
+            <w:r>
+              <w:t>93</w:t>
+            </w:r>
+          </w:p>
+        </w:tc>
+        <w:tc>
+          <w:tcPr>
+            <w:tcW w:w="1294" w:type="dxa"/>
+          </w:tcPr>
+          <w:p/>
+        </w:tc>
+        <w:tc>
+          <w:tcPr>
+            <w:tcW w:w="1408" w:type="dxa"/>
+          </w:tcPr>
+          <w:p>
+            <w:r>
+              <w:t>83</w:t>
+            </w:r>
+          </w:p>
+        </w:tc>
+      </w:tr>
+    </w:tbl>
+    <w:p>
+      <w:pPr>
+        <w:pStyle w:val="Heading2"/>
+      </w:pPr>
+      <w:r>
+        <w:t>Interpretation and limitations</w:t>
+      </w:r>
+    </w:p>
+    <w:p>
+      <w:r>
+        <w:t xml:space="preserve">Under these assumptions, Stack </w:t>
+      </w:r>
+      <w:r>
+        <w:t>A</w:t>
+      </w:r>
+      <w:r>
+        <w:t xml:space="preserve"> scores </w:t>
+      </w:r>
+      <w:r>
+        <w:t>93%</w:t>
+      </w:r>
+      <w:r>
+        <w:t xml:space="preserve"> and Stack </w:t>
+      </w:r>
+      <w:r>
+        <w:t>B</w:t>
+      </w:r>
+      <w:r>
+        <w:t xml:space="preserve"> </w:t>
+      </w:r>
+      <w:r>
+        <w:t>83%</w:t>
+      </w:r>
+      <w:r>
+        <w:t xml:space="preserve">. The </w:t>
+      </w:r>
+      <w:r>
+        <w:t>10%</w:t>
+      </w:r>
+      <w:r>
+        <w:t xml:space="preserve"> difference is </w:t>
+      </w:r>
+      <w:r>
+        <w:t>prevalent enough</w:t>
+      </w:r>
+      <w:r>
+        <w:t xml:space="preserve"> to justify a preference</w:t>
+      </w:r>
+      <w:r>
+        <w:t>, but is not universal</w:t>
+      </w:r>
+      <w:r>
+        <w:t>. Stack B gains from security, maintainability and testing conventions; Stack A gains from a lower learning barrier and likely lower initial team</w:t>
+      </w:r>
+      <w:r>
+        <w:t xml:space="preserve"> training</w:t>
+      </w:r>
+      <w:r>
+        <w:t xml:space="preserve"> overhead. A team already proficient in TypeScript, a short deadline or a low-memory hosting constraint could </w:t>
+      </w:r>
+      <w:r>
+        <w:t>come to</w:t>
+      </w:r>
+      <w:r>
+        <w:t xml:space="preserve"> the</w:t>
+      </w:r>
+      <w:r>
+        <w:t xml:space="preserve"> same</w:t>
+      </w:r>
+      <w:r>
+        <w:t xml:space="preserve"> result. Conversely, strict governance, complex domain rules or strong Java capability could increase Stack B's advantage.</w:t>
+      </w:r>
+    </w:p>
+    <w:p>
+      <w:r>
+        <w:t xml:space="preserve">The matrix simplifies uncertainty: ordinal scores can create false precision, weights </w:t>
+      </w:r>
+      <w:r>
+        <w:t>can change from</w:t>
+      </w:r>
+      <w:r>
+        <w:t xml:space="preserve"> stakeholder judgements, criteria can overlap, and no prototype or workload benchmark has been performed.</w:t>
+      </w:r>
+    </w:p>
+    <w:p>
+      <w:pPr>
+        <w:pStyle w:val="Heading2"/>
+      </w:pPr>
+      <w:r>
+        <w:t>Critical conclusion</w:t>
+      </w:r>
+    </w:p>
+    <w:p>
+      <w:r>
+        <w:t>Due to the contextual nature of suitability, the most popular or highest-scoring stack is not always accurate. A popular stack might provide expertise and community support, but it might still clash with security requirements, the infrastructure that is already in place, the timeline, the budget, or the operational capacity. Similarly, a weighted matrix does not take the role of stakeholder validation, risk analysis, technical testing, or responsible engineering judgment; it merely makes assumptions evident.</w:t>
+      </w:r>
+      <w:r>
+        <w:t xml:space="preserve"> </w:t>
+      </w:r>
+      <w:r>
+        <w:t>Therefore, the stack that best satisfies confirmed project needs and constraints</w:t>
+      </w:r>
+      <w:r>
+        <w:t xml:space="preserve">, </w:t>
+      </w:r>
+      <w:r>
+        <w:t>rather than the alternative with the best reputation or a little higher generic score</w:t>
+      </w:r>
+      <w:r>
+        <w:t xml:space="preserve">, </w:t>
+      </w:r>
+      <w:r>
+        <w:t>is the justifiable decision.</w:t>
+      </w:r>
+    </w:p>
     <w:p>
       <w:pPr>
         <w:pStyle w:val="Heading1"/>
       </w:pPr>
       <w:bookmarkStart w:id="3" w:name="_Toc239229509"/>
       <w:r>
+        <w:lastRenderedPageBreak/>
         <w:t>Question 4 - Responsible AI in Software Engineering</w:t>
       </w:r>
       <w:bookmarkEnd w:id="3"/>
@@ -2420,7 +3993,6 @@
           </w:tcPr>
           <w:p>
             <w:r>
-              <w:lastRenderedPageBreak/>
               <w:t>Plausible</w:t>
             </w:r>
             <w:r>
@@ -2561,6 +4133,7 @@
         <w:pStyle w:val="Heading2"/>
       </w:pPr>
       <w:r>
+        <w:lastRenderedPageBreak/>
         <w:t>Human Verification and Control Process</w:t>
       </w:r>
     </w:p>
@@ -2725,7 +4298,13 @@
         <w:t xml:space="preserve">affect production without the approval of a trained professional who would be held responsible for the design and decisions </w:t>
       </w:r>
       <w:r>
-        <w:t>that effect production.</w:t>
+        <w:t xml:space="preserve">that </w:t>
+      </w:r>
+      <w:r>
+        <w:t>affect</w:t>
+      </w:r>
+      <w:r>
+        <w:t xml:space="preserve"> production.</w:t>
       </w:r>
       <w:r>
         <w:t xml:space="preserve"> In the modern workplace </w:t>
@@ -2762,7 +4341,6 @@
           <w:docPartUnique/>
         </w:docPartObj>
       </w:sdtPr>
-      <w:sdtEndPr/>
       <w:sdtContent>
         <w:p>
           <w:pPr>
@@ -2778,7 +4356,6 @@
             <w:id w:val="-573587230"/>
             <w:bibliography/>
           </w:sdtPr>
-          <w:sdtEndPr/>
           <w:sdtContent>
             <w:p>
               <w:pPr>
@@ -2887,6 +4464,104 @@
                 <w:rPr>
                   <w:noProof/>
                 </w:rPr>
+                <w:t xml:space="preserve">NestJS, 2026. </w:t>
+              </w:r>
+              <w:r>
+                <w:rPr>
+                  <w:i/>
+                  <w:iCs/>
+                  <w:noProof/>
+                </w:rPr>
+                <w:t xml:space="preserve">A progressive Node.js framework. </w:t>
+              </w:r>
+              <w:r>
+                <w:rPr>
+                  <w:noProof/>
+                </w:rPr>
+                <w:t xml:space="preserve">[Online] </w:t>
+              </w:r>
+              <w:r>
+                <w:rPr>
+                  <w:noProof/>
+                </w:rPr>
+                <w:br/>
+                <w:t xml:space="preserve">Available at: </w:t>
+              </w:r>
+              <w:r>
+                <w:rPr>
+                  <w:noProof/>
+                  <w:u w:val="single"/>
+                </w:rPr>
+                <w:t>https://docs.nestjs.com</w:t>
+              </w:r>
+              <w:r>
+                <w:rPr>
+                  <w:noProof/>
+                </w:rPr>
+                <w:br/>
+                <w:t>[Accessed 3 August 2026].</w:t>
+              </w:r>
+            </w:p>
+            <w:p>
+              <w:pPr>
+                <w:pStyle w:val="Bibliography"/>
+                <w:rPr>
+                  <w:noProof/>
+                </w:rPr>
+              </w:pPr>
+              <w:r>
+                <w:rPr>
+                  <w:noProof/>
+                </w:rPr>
+                <w:t xml:space="preserve">Spring, 2026. </w:t>
+              </w:r>
+              <w:r>
+                <w:rPr>
+                  <w:i/>
+                  <w:iCs/>
+                  <w:noProof/>
+                </w:rPr>
+                <w:t xml:space="preserve">Spring boot. </w:t>
+              </w:r>
+              <w:r>
+                <w:rPr>
+                  <w:noProof/>
+                </w:rPr>
+                <w:t xml:space="preserve">[Online] </w:t>
+              </w:r>
+              <w:r>
+                <w:rPr>
+                  <w:noProof/>
+                </w:rPr>
+                <w:br/>
+                <w:t xml:space="preserve">Available at: </w:t>
+              </w:r>
+              <w:r>
+                <w:rPr>
+                  <w:noProof/>
+                  <w:u w:val="single"/>
+                </w:rPr>
+                <w:t>https://docs.spring.io/spring-boot/index.html</w:t>
+              </w:r>
+              <w:r>
+                <w:rPr>
+                  <w:noProof/>
+                </w:rPr>
+                <w:br/>
+                <w:t>[Accessed 3 August 2026].</w:t>
+              </w:r>
+            </w:p>
+            <w:p>
+              <w:pPr>
+                <w:pStyle w:val="Bibliography"/>
+                <w:rPr>
+                  <w:noProof/>
+                </w:rPr>
+              </w:pPr>
+              <w:r>
+                <w:rPr>
+                  <w:noProof/>
+                </w:rPr>
                 <w:t xml:space="preserve">Tosi, D., 2024. Studying the quality of source code generated by different ai generative engines: An empirical evaluation.. </w:t>
               </w:r>
               <w:r>
@@ -2905,6 +4580,9 @@
               </w:r>
             </w:p>
             <w:p>
+              <w:pPr>
+                <w:spacing w:after="100" w:line="260" w:lineRule="auto"/>
+              </w:pPr>
               <w:r>
                 <w:rPr>
                   <w:b/>
@@ -2945,12 +4623,12 @@
         <w:tblLook w:val="0620" w:firstRow="1" w:lastRow="0" w:firstColumn="0" w:lastColumn="0" w:noHBand="1" w:noVBand="1"/>
       </w:tblPr>
       <w:tblGrid>
-        <w:gridCol w:w="1134"/>
-        <w:gridCol w:w="1076"/>
-        <w:gridCol w:w="1814"/>
-        <w:gridCol w:w="1077"/>
-        <w:gridCol w:w="2551"/>
-        <w:gridCol w:w="1984"/>
+        <w:gridCol w:w="1131"/>
+        <w:gridCol w:w="1203"/>
+        <w:gridCol w:w="1788"/>
+        <w:gridCol w:w="1070"/>
+        <w:gridCol w:w="2496"/>
+        <w:gridCol w:w="1948"/>
       </w:tblGrid>
       <w:tr>
         <w:trPr>
@@ -3258,37 +4936,85 @@
           <w:tcPr>
             <w:tcW w:w="1134" w:type="dxa"/>
           </w:tcPr>
-          <w:p/>
+          <w:p>
+            <w:r>
+              <w:t>Mogau</w:t>
+            </w:r>
+          </w:p>
         </w:tc>
         <w:tc>
           <w:tcPr>
             <w:tcW w:w="1076" w:type="dxa"/>
           </w:tcPr>
-          <w:p/>
+          <w:p>
+            <w:r>
+              <w:t>Perplexity</w:t>
+            </w:r>
+          </w:p>
         </w:tc>
         <w:tc>
           <w:tcPr>
             <w:tcW w:w="1814" w:type="dxa"/>
           </w:tcPr>
-          <w:p/>
+          <w:p>
+            <w:r>
+              <w:t>Find good sources to support or criticise my suggestion</w:t>
+            </w:r>
+            <w:r>
+              <w:t>s.</w:t>
+            </w:r>
+          </w:p>
         </w:tc>
         <w:tc>
           <w:tcPr>
             <w:tcW w:w="1077" w:type="dxa"/>
           </w:tcPr>
-          <w:p/>
+          <w:p>
+            <w:r>
+              <w:t>Yes</w:t>
+            </w:r>
+          </w:p>
         </w:tc>
         <w:tc>
           <w:tcPr>
             <w:tcW w:w="2551" w:type="dxa"/>
           </w:tcPr>
-          <w:p/>
+          <w:p>
+            <w:r>
+              <w:t>I w</w:t>
+            </w:r>
+            <w:r>
+              <w:t>ent to the website</w:t>
+            </w:r>
+            <w:r>
+              <w:t>s</w:t>
+            </w:r>
+            <w:r>
+              <w:t xml:space="preserve"> of the sources and read through the information to check </w:t>
+            </w:r>
+            <w:r>
+              <w:t>i</w:t>
+            </w:r>
+            <w:r>
+              <w:t>f I can use it or not.</w:t>
+            </w:r>
+          </w:p>
         </w:tc>
         <w:tc>
           <w:tcPr>
             <w:tcW w:w="1984" w:type="dxa"/>
           </w:tcPr>
-          <w:p/>
+          <w:p>
+            <w:r>
+              <w:t xml:space="preserve">Out of the 4 sources given only </w:t>
+            </w:r>
+            <w:r>
+              <w:t>2</w:t>
+            </w:r>
+            <w:r>
+              <w:t xml:space="preserve"> were used, because the rejected one was vague and more business orientated and did not give enough technical information.</w:t>
+            </w:r>
+          </w:p>
         </w:tc>
       </w:tr>
     </w:tbl>
@@ -3377,7 +5103,6 @@
               <w:dataBinding w:prefixMappings="xmlns:ns0='http://purl.org/dc/elements/1.1/' xmlns:ns1='http://schemas.openxmlformats.org/package/2006/metadata/core-properties' " w:xpath="/ns1:coreProperties[1]/ns0:subject[1]" w:storeItemID="{6C3C8BC8-F283-45AE-878A-BAB7291924A1}"/>
               <w:text/>
             </w:sdtPr>
-            <w:sdtEndPr/>
             <w:sdtContent>
               <w:r>
                 <w:t>SEN381</w:t>
@@ -3406,7 +5131,6 @@
           <w:dataBinding w:prefixMappings="xmlns:ns0='http://purl.org/dc/elements/1.1/' xmlns:ns1='http://schemas.openxmlformats.org/package/2006/metadata/core-properties' " w:xpath="/ns1:coreProperties[1]/ns0:creator[1]" w:storeItemID="{6C3C8BC8-F283-45AE-878A-BAB7291924A1}"/>
           <w:text/>
         </w:sdtPr>
-        <w:sdtEndPr/>
         <w:sdtContent>
           <w:tc>
             <w:tcPr>
@@ -3622,8 +5346,124 @@
       </w:rPr>
     </w:lvl>
   </w:abstractNum>
+  <w:abstractNum w:abstractNumId="1" w15:restartNumberingAfterBreak="0">
+    <w:nsid w:val="7F315E52"/>
+    <w:multiLevelType w:val="hybridMultilevel"/>
+    <w:tmpl w:val="52F60928"/>
+    <w:lvl w:ilvl="0" w:tplc="08090001">
+      <w:start w:val="1"/>
+      <w:numFmt w:val="bullet"/>
+      <w:lvlText w:val=""/>
+      <w:lvlJc w:val="left"/>
+      <w:pPr>
+        <w:ind w:left="720" w:hanging="360"/>
+      </w:pPr>
+      <w:rPr>
+        <w:rFonts w:ascii="Symbol" w:hAnsi="Symbol" w:hint="default"/>
+      </w:rPr>
+    </w:lvl>
+    <w:lvl w:ilvl="1" w:tplc="08090003" w:tentative="1">
+      <w:start w:val="1"/>
+      <w:numFmt w:val="bullet"/>
+      <w:lvlText w:val="o"/>
+      <w:lvlJc w:val="left"/>
+      <w:pPr>
+        <w:ind w:left="1440" w:hanging="360"/>
+      </w:pPr>
+      <w:rPr>
+        <w:rFonts w:ascii="Courier New" w:hAnsi="Courier New" w:cs="Courier New" w:hint="default"/>
+      </w:rPr>
+    </w:lvl>
+    <w:lvl w:ilvl="2" w:tplc="08090005" w:tentative="1">
+      <w:start w:val="1"/>
+      <w:numFmt w:val="bullet"/>
+      <w:lvlText w:val=""/>
+      <w:lvlJc w:val="left"/>
+      <w:pPr>
+        <w:ind w:left="2160" w:hanging="360"/>
+      </w:pPr>
+      <w:rPr>
+        <w:rFonts w:ascii="Wingdings" w:hAnsi="Wingdings" w:hint="default"/>
+      </w:rPr>
+    </w:lvl>
+    <w:lvl w:ilvl="3" w:tplc="08090001" w:tentative="1">
+      <w:start w:val="1"/>
+      <w:numFmt w:val="bullet"/>
+      <w:lvlText w:val=""/>
+      <w:lvlJc w:val="left"/>
+      <w:pPr>
+        <w:ind w:left="2880" w:hanging="360"/>
+      </w:pPr>
+      <w:rPr>
+        <w:rFonts w:ascii="Symbol" w:hAnsi="Symbol" w:hint="default"/>
+      </w:rPr>
+    </w:lvl>
+    <w:lvl w:ilvl="4" w:tplc="08090003" w:tentative="1">
+      <w:start w:val="1"/>
+      <w:numFmt w:val="bullet"/>
+      <w:lvlText w:val="o"/>
+      <w:lvlJc w:val="left"/>
+      <w:pPr>
+        <w:ind w:left="3600" w:hanging="360"/>
+      </w:pPr>
+      <w:rPr>
+        <w:rFonts w:ascii="Courier New" w:hAnsi="Courier New" w:cs="Courier New" w:hint="default"/>
+      </w:rPr>
+    </w:lvl>
+    <w:lvl w:ilvl="5" w:tplc="08090005" w:tentative="1">
+      <w:start w:val="1"/>
+      <w:numFmt w:val="bullet"/>
+      <w:lvlText w:val=""/>
+      <w:lvlJc w:val="left"/>
+      <w:pPr>
+        <w:ind w:left="4320" w:hanging="360"/>
+      </w:pPr>
+      <w:rPr>
+        <w:rFonts w:ascii="Wingdings" w:hAnsi="Wingdings" w:hint="default"/>
+      </w:rPr>
+    </w:lvl>
+    <w:lvl w:ilvl="6" w:tplc="08090001" w:tentative="1">
+      <w:start w:val="1"/>
+      <w:numFmt w:val="bullet"/>
+      <w:lvlText w:val=""/>
+      <w:lvlJc w:val="left"/>
+      <w:pPr>
+        <w:ind w:left="5040" w:hanging="360"/>
+      </w:pPr>
+      <w:rPr>
+        <w:rFonts w:ascii="Symbol" w:hAnsi="Symbol" w:hint="default"/>
+      </w:rPr>
+    </w:lvl>
+    <w:lvl w:ilvl="7" w:tplc="08090003" w:tentative="1">
+      <w:start w:val="1"/>
+      <w:numFmt w:val="bullet"/>
+      <w:lvlText w:val="o"/>
+      <w:lvlJc w:val="left"/>
+      <w:pPr>
+        <w:ind w:left="5760" w:hanging="360"/>
+      </w:pPr>
+      <w:rPr>
+        <w:rFonts w:ascii="Courier New" w:hAnsi="Courier New" w:cs="Courier New" w:hint="default"/>
+      </w:rPr>
+    </w:lvl>
+    <w:lvl w:ilvl="8" w:tplc="08090005" w:tentative="1">
+      <w:start w:val="1"/>
+      <w:numFmt w:val="bullet"/>
+      <w:lvlText w:val=""/>
+      <w:lvlJc w:val="left"/>
+      <w:pPr>
+        <w:ind w:left="6480" w:hanging="360"/>
+      </w:pPr>
+      <w:rPr>
+        <w:rFonts w:ascii="Wingdings" w:hAnsi="Wingdings" w:hint="default"/>
+      </w:rPr>
+    </w:lvl>
+  </w:abstractNum>
   <w:num w:numId="1" w16cid:durableId="832834957">
     <w:abstractNumId w:val="0"/>
+  </w:num>
+  <w:num w:numId="2" w16cid:durableId="149491665">
+    <w:abstractNumId w:val="1"/>
   </w:num>
 </w:numbering>
 </file>
@@ -4771,6 +6611,18 @@
     <w:unhideWhenUsed/>
     <w:rsid w:val="00420834"/>
   </w:style>
+  <w:style w:type="character" w:styleId="FollowedHyperlink">
+    <w:name w:val="FollowedHyperlink"/>
+    <w:basedOn w:val="DefaultParagraphFont"/>
+    <w:uiPriority w:val="99"/>
+    <w:semiHidden/>
+    <w:unhideWhenUsed/>
+    <w:rsid w:val="00024499"/>
+    <w:rPr>
+      <w:color w:val="96607D" w:themeColor="followedHyperlink"/>
+      <w:u w:val="single"/>
+    </w:rPr>
+  </w:style>
 </w:styles>
 </file>
 
@@ -4882,6 +6734,20 @@
     <w:pitch w:val="variable"/>
     <w:sig w:usb0="20000287" w:usb1="00000003" w:usb2="00000000" w:usb3="00000000" w:csb0="0000019F" w:csb1="00000000"/>
   </w:font>
+  <w:font w:name="Calibri">
+    <w:panose1 w:val="020F0502020204030204"/>
+    <w:charset w:val="00"/>
+    <w:family w:val="swiss"/>
+    <w:pitch w:val="variable"/>
+    <w:sig w:usb0="E4002EFF" w:usb1="C000247B" w:usb2="00000009" w:usb3="00000000" w:csb0="000001FF" w:csb1="00000000"/>
+  </w:font>
+  <w:font w:name="Calibri Light">
+    <w:panose1 w:val="020F0302020204030204"/>
+    <w:charset w:val="00"/>
+    <w:family w:val="swiss"/>
+    <w:pitch w:val="variable"/>
+    <w:sig w:usb0="E4002EFF" w:usb1="C000247B" w:usb2="00000009" w:usb3="00000000" w:csb0="000001FF" w:csb1="00000000"/>
+  </w:font>
 </w:fonts>
 </file>
 
@@ -4902,10 +6768,12 @@
   <w:rsids>
     <w:rsidRoot w:val="00B9532F"/>
     <w:rsid w:val="000F317B"/>
+    <w:rsid w:val="003C543F"/>
     <w:rsid w:val="006049D6"/>
     <w:rsid w:val="00B9532F"/>
     <w:rsid w:val="00C623A4"/>
     <w:rsid w:val="00D71C10"/>
+    <w:rsid w:val="00E12F5E"/>
   </w:rsids>
   <m:mathPr>
     <m:mathFont m:val="Cambria Math"/>
@@ -5737,7 +7605,7 @@
     <b:Year>2024</b:Year>
     <b:Pages>1386720</b:Pages>
     <b:Volume>7</b:Volume>
-    <b:RefOrder>4</b:RefOrder>
+    <b:RefOrder>6</b:RefOrder>
   </b:Source>
   <b:Source>
     <b:Tag>Tos241</b:Tag>
@@ -5759,13 +7627,47 @@
     <b:Pages>188</b:Pages>
     <b:Volume>16</b:Volume>
     <b:Issue>6</b:Issue>
+    <b:RefOrder>5</b:RefOrder>
+  </b:Source>
+  <b:Source>
+    <b:Tag>Spr26</b:Tag>
+    <b:SourceType>InternetSite</b:SourceType>
+    <b:Guid>{A2A55449-E624-43DE-8EAB-EF4F4D7AA8ED}</b:Guid>
+    <b:Author>
+      <b:Author>
+        <b:Corporate>Spring</b:Corporate>
+      </b:Author>
+    </b:Author>
+    <b:Title>Spring boot</b:Title>
+    <b:Year>2026</b:Year>
+    <b:YearAccessed>2026</b:YearAccessed>
+    <b:MonthAccessed>August</b:MonthAccessed>
+    <b:DayAccessed>3</b:DayAccessed>
+    <b:URL>https://docs.spring.io/spring-boot/index.html</b:URL>
     <b:RefOrder>3</b:RefOrder>
+  </b:Source>
+  <b:Source>
+    <b:Tag>Nes26</b:Tag>
+    <b:SourceType>InternetSite</b:SourceType>
+    <b:Guid>{890C93F3-FD29-43EA-8548-98131823BBEA}</b:Guid>
+    <b:Title>A progressive Node.js framework</b:Title>
+    <b:Year>2026</b:Year>
+    <b:Author>
+      <b:Author>
+        <b:Corporate>NestJS</b:Corporate>
+      </b:Author>
+    </b:Author>
+    <b:YearAccessed>2026</b:YearAccessed>
+    <b:MonthAccessed>August</b:MonthAccessed>
+    <b:DayAccessed>3</b:DayAccessed>
+    <b:URL>https://docs.nestjs.com</b:URL>
+    <b:RefOrder>4</b:RefOrder>
   </b:Source>
 </b:Sources>
 </file>
 
 <file path=customXml/itemProps1.xml><?xml version="1.0" encoding="utf-8"?>
-<ds:datastoreItem xmlns:ds="http://schemas.openxmlformats.org/officeDocument/2006/customXml" ds:itemID="{5F2F4DE5-E48F-4908-AD9B-3A63415CDD32}">
+<ds:datastoreItem xmlns:ds="http://schemas.openxmlformats.org/officeDocument/2006/customXml" ds:itemID="{61E5F1F5-242C-42C3-BCA2-25914395CBDE}">
   <ds:schemaRefs>
     <ds:schemaRef ds:uri="http://schemas.openxmlformats.org/officeDocument/2006/bibliography"/>
   </ds:schemaRefs>

</xml_diff>

<commit_message>
fixed the month accessed of my sources
I fixed the month accessed of my 2 sources from august to September.
</commit_message>
<xml_diff>
--- a/SEN381_Assignment1_2026_Group-I.docx
+++ b/SEN381_Assignment1_2026_Group-I.docx
@@ -10,7 +10,6 @@
           <w:docPartUnique/>
         </w:docPartObj>
       </w:sdtPr>
-      <w:sdtEndPr/>
       <w:sdtContent>
         <w:p/>
         <w:p>
@@ -96,7 +95,6 @@
                                     <w:dataBinding w:prefixMappings="xmlns:ns0='http://purl.org/dc/elements/1.1/' xmlns:ns1='http://schemas.openxmlformats.org/package/2006/metadata/core-properties' " w:xpath="/ns1:coreProperties[1]/ns0:title[1]" w:storeItemID="{6C3C8BC8-F283-45AE-878A-BAB7291924A1}"/>
                                     <w:text/>
                                   </w:sdtPr>
-                                  <w:sdtEndPr/>
                                   <w:sdtContent>
                                     <w:r>
                                       <w:rPr>
@@ -123,7 +121,6 @@
                                   <w:dataBinding w:prefixMappings="xmlns:ns0='http://purl.org/dc/elements/1.1/' xmlns:ns1='http://schemas.openxmlformats.org/package/2006/metadata/core-properties' " w:xpath="/ns1:coreProperties[1]/ns0:subject[1]" w:storeItemID="{6C3C8BC8-F283-45AE-878A-BAB7291924A1}"/>
                                   <w:text/>
                                 </w:sdtPr>
-                                <w:sdtEndPr/>
                                 <w:sdtContent>
                                   <w:p>
                                     <w:pPr>
@@ -162,7 +159,6 @@
                                   <w:dataBinding w:prefixMappings="xmlns:ns0='http://purl.org/dc/elements/1.1/' xmlns:ns1='http://schemas.openxmlformats.org/package/2006/metadata/core-properties' " w:xpath="/ns1:coreProperties[1]/ns0:creator[1]" w:storeItemID="{6C3C8BC8-F283-45AE-878A-BAB7291924A1}"/>
                                   <w:text/>
                                 </w:sdtPr>
-                                <w:sdtEndPr/>
                                 <w:sdtContent>
                                   <w:p>
                                     <w:pPr>
@@ -182,7 +178,27 @@
                                         <w:sz w:val="24"/>
                                         <w:szCs w:val="24"/>
                                       </w:rPr>
-                                      <w:t>Gerald Enright 577830 | Keletso Marota 601632  | Mogau Malope</w:t>
+                                      <w:t xml:space="preserve">Gerald Enright 577830 | Keletso Marota </w:t>
+                                    </w:r>
+                                    <w:proofErr w:type="gramStart"/>
+                                    <w:r>
+                                      <w:rPr>
+                                        <w:caps/>
+                                        <w:color w:val="A02B93" w:themeColor="accent5"/>
+                                        <w:sz w:val="24"/>
+                                        <w:szCs w:val="24"/>
+                                      </w:rPr>
+                                      <w:t>601632  |</w:t>
+                                    </w:r>
+                                    <w:proofErr w:type="gramEnd"/>
+                                    <w:r>
+                                      <w:rPr>
+                                        <w:caps/>
+                                        <w:color w:val="A02B93" w:themeColor="accent5"/>
+                                        <w:sz w:val="24"/>
+                                        <w:szCs w:val="24"/>
+                                      </w:rPr>
+                                      <w:t xml:space="preserve"> Mogau Malope</w:t>
                                     </w:r>
                                     <w:r>
                                       <w:rPr>
@@ -258,7 +274,6 @@
                               <w:dataBinding w:prefixMappings="xmlns:ns0='http://purl.org/dc/elements/1.1/' xmlns:ns1='http://schemas.openxmlformats.org/package/2006/metadata/core-properties' " w:xpath="/ns1:coreProperties[1]/ns0:title[1]" w:storeItemID="{6C3C8BC8-F283-45AE-878A-BAB7291924A1}"/>
                               <w:text/>
                             </w:sdtPr>
-                            <w:sdtEndPr/>
                             <w:sdtContent>
                               <w:r>
                                 <w:rPr>
@@ -285,7 +300,6 @@
                             <w:dataBinding w:prefixMappings="xmlns:ns0='http://purl.org/dc/elements/1.1/' xmlns:ns1='http://schemas.openxmlformats.org/package/2006/metadata/core-properties' " w:xpath="/ns1:coreProperties[1]/ns0:subject[1]" w:storeItemID="{6C3C8BC8-F283-45AE-878A-BAB7291924A1}"/>
                             <w:text/>
                           </w:sdtPr>
-                          <w:sdtEndPr/>
                           <w:sdtContent>
                             <w:p>
                               <w:pPr>
@@ -324,7 +338,6 @@
                             <w:dataBinding w:prefixMappings="xmlns:ns0='http://purl.org/dc/elements/1.1/' xmlns:ns1='http://schemas.openxmlformats.org/package/2006/metadata/core-properties' " w:xpath="/ns1:coreProperties[1]/ns0:creator[1]" w:storeItemID="{6C3C8BC8-F283-45AE-878A-BAB7291924A1}"/>
                             <w:text/>
                           </w:sdtPr>
-                          <w:sdtEndPr/>
                           <w:sdtContent>
                             <w:p>
                               <w:pPr>
@@ -344,7 +357,27 @@
                                   <w:sz w:val="24"/>
                                   <w:szCs w:val="24"/>
                                 </w:rPr>
-                                <w:t>Gerald Enright 577830 | Keletso Marota 601632  | Mogau Malope</w:t>
+                                <w:t xml:space="preserve">Gerald Enright 577830 | Keletso Marota </w:t>
+                              </w:r>
+                              <w:proofErr w:type="gramStart"/>
+                              <w:r>
+                                <w:rPr>
+                                  <w:caps/>
+                                  <w:color w:val="A02B93" w:themeColor="accent5"/>
+                                  <w:sz w:val="24"/>
+                                  <w:szCs w:val="24"/>
+                                </w:rPr>
+                                <w:t>601632  |</w:t>
+                              </w:r>
+                              <w:proofErr w:type="gramEnd"/>
+                              <w:r>
+                                <w:rPr>
+                                  <w:caps/>
+                                  <w:color w:val="A02B93" w:themeColor="accent5"/>
+                                  <w:sz w:val="24"/>
+                                  <w:szCs w:val="24"/>
+                                </w:rPr>
+                                <w:t xml:space="preserve"> Mogau Malope</w:t>
                               </w:r>
                               <w:r>
                                 <w:rPr>
@@ -462,7 +495,6 @@
                                     <w:calendar w:val="gregorian"/>
                                   </w:date>
                                 </w:sdtPr>
-                                <w:sdtEndPr/>
                                 <w:sdtContent>
                                   <w:p>
                                     <w:pPr>
@@ -530,7 +562,6 @@
                               <w:calendar w:val="gregorian"/>
                             </w:date>
                           </w:sdtPr>
-                          <w:sdtEndPr/>
                           <w:sdtContent>
                             <w:p>
                               <w:pPr>
@@ -2553,7 +2584,6 @@
           <w:id w:val="1469239688"/>
           <w:citation/>
         </w:sdtPr>
-        <w:sdtEndPr/>
         <w:sdtContent>
           <w:r>
             <w:fldChar w:fldCharType="begin"/>
@@ -3498,7 +3528,6 @@
           <w:id w:val="449137313"/>
           <w:citation/>
         </w:sdtPr>
-        <w:sdtEndPr/>
         <w:sdtContent>
           <w:r>
             <w:fldChar w:fldCharType="begin"/>
@@ -3933,7 +3962,33 @@
                 <w:lang w:eastAsia="en-ZA"/>
                 <w14:ligatures w14:val="none"/>
               </w:rPr>
-              <w:t>Security and architectural changes may require restructuring already-built components, increasing rework and leaving vulnerabilities or architectural debt.</w:t>
+              <w:t xml:space="preserve">Security and architectural changes may require restructuring already-built components, </w:t>
+            </w:r>
+            <w:proofErr w:type="gramStart"/>
+            <w:r>
+              <w:rPr>
+                <w:rFonts w:ascii="Aptos" w:eastAsia="Times New Roman" w:hAnsi="Aptos" w:cs="Segoe UI"/>
+                <w:color w:val="000000"/>
+                <w:kern w:val="0"/>
+                <w:sz w:val="16"/>
+                <w:szCs w:val="16"/>
+                <w:lang w:eastAsia="en-ZA"/>
+                <w14:ligatures w14:val="none"/>
+              </w:rPr>
+              <w:t>increasing</w:t>
+            </w:r>
+            <w:proofErr w:type="gramEnd"/>
+            <w:r>
+              <w:rPr>
+                <w:rFonts w:ascii="Aptos" w:eastAsia="Times New Roman" w:hAnsi="Aptos" w:cs="Segoe UI"/>
+                <w:color w:val="000000"/>
+                <w:kern w:val="0"/>
+                <w:sz w:val="16"/>
+                <w:szCs w:val="16"/>
+                <w:lang w:eastAsia="en-ZA"/>
+                <w14:ligatures w14:val="none"/>
+              </w:rPr>
+              <w:t xml:space="preserve"> rework and leaving vulnerabilities or architectural debt.</w:t>
             </w:r>
           </w:p>
         </w:tc>
@@ -4972,7 +5027,31 @@
           <w:lang w:eastAsia="en-ZA"/>
           <w14:ligatures w14:val="none"/>
         </w:rPr>
-        <w:t>If postponed: Security and architectural changes may require restructuring already-built components, increasing rework and leaving vulnerabilities or architectural debt. ISO/IEC/IEEE 42010:2022 provides a current framework for expressing architecture descriptions, while NIST SP 800-53 provides a broad catalogue of security and privacy controls (ISO, 2022; NIST, 2020/2025).</w:t>
+        <w:t xml:space="preserve">If postponed: Security and architectural changes may require restructuring already-built components, </w:t>
+      </w:r>
+      <w:proofErr w:type="gramStart"/>
+      <w:r>
+        <w:rPr>
+          <w:rFonts w:eastAsia="Times New Roman" w:cs="Times New Roman"/>
+          <w:color w:val="000000"/>
+          <w:kern w:val="0"/>
+          <w:sz w:val="22"/>
+          <w:lang w:eastAsia="en-ZA"/>
+          <w14:ligatures w14:val="none"/>
+        </w:rPr>
+        <w:t>increasing</w:t>
+      </w:r>
+      <w:proofErr w:type="gramEnd"/>
+      <w:r>
+        <w:rPr>
+          <w:rFonts w:eastAsia="Times New Roman" w:cs="Times New Roman"/>
+          <w:color w:val="000000"/>
+          <w:kern w:val="0"/>
+          <w:sz w:val="22"/>
+          <w:lang w:eastAsia="en-ZA"/>
+          <w14:ligatures w14:val="none"/>
+        </w:rPr>
+        <w:t xml:space="preserve"> rework and leaving vulnerabilities or architectural debt. ISO/IEC/IEEE 42010:2022 provides a current framework for expressing architecture descriptions, while NIST SP 800-53 provides a broad catalogue of security and privacy controls (ISO, 2022; NIST, 2020/2025).</w:t>
       </w:r>
     </w:p>
     <w:p>
@@ -5165,7 +5244,31 @@
           <w:lang w:eastAsia="en-ZA"/>
           <w14:ligatures w14:val="none"/>
         </w:rPr>
-        <w:t>If postponed: An unsuitable persistence model can become embedded throughout the codebase, making migrations, performance improvements and consistency changes more expensive. Kleppmann emphasises reliability, scalability, maintainability and evolvability as central concerns in data-intensive systems (Kleppmann, 2017).</w:t>
+        <w:t xml:space="preserve">If postponed: An unsuitable persistence model can become embedded throughout the codebase, making migrations, performance improvements and consistency changes more expensive. </w:t>
+      </w:r>
+      <w:proofErr w:type="spellStart"/>
+      <w:r>
+        <w:rPr>
+          <w:rFonts w:eastAsia="Times New Roman" w:cs="Times New Roman"/>
+          <w:color w:val="000000"/>
+          <w:kern w:val="0"/>
+          <w:szCs w:val="24"/>
+          <w:lang w:eastAsia="en-ZA"/>
+          <w14:ligatures w14:val="none"/>
+        </w:rPr>
+        <w:t>Kleppmann</w:t>
+      </w:r>
+      <w:proofErr w:type="spellEnd"/>
+      <w:r>
+        <w:rPr>
+          <w:rFonts w:eastAsia="Times New Roman" w:cs="Times New Roman"/>
+          <w:color w:val="000000"/>
+          <w:kern w:val="0"/>
+          <w:szCs w:val="24"/>
+          <w:lang w:eastAsia="en-ZA"/>
+          <w14:ligatures w14:val="none"/>
+        </w:rPr>
+        <w:t xml:space="preserve"> emphasises reliability, scalability, maintainability and evolvability as central concerns in data-intensive systems (Kleppmann, 2017).</w:t>
       </w:r>
     </w:p>
     <w:p>
@@ -5190,7 +5293,31 @@
           <w:lang w:eastAsia="en-ZA"/>
           <w14:ligatures w14:val="none"/>
         </w:rPr>
-        <w:t>Evidence: Kleppmann (2017).</w:t>
+        <w:t xml:space="preserve">Evidence: </w:t>
+      </w:r>
+      <w:proofErr w:type="spellStart"/>
+      <w:r>
+        <w:rPr>
+          <w:rFonts w:eastAsia="Times New Roman" w:cs="Times New Roman"/>
+          <w:color w:val="000000"/>
+          <w:kern w:val="0"/>
+          <w:szCs w:val="24"/>
+          <w:lang w:eastAsia="en-ZA"/>
+          <w14:ligatures w14:val="none"/>
+        </w:rPr>
+        <w:t>Kleppmann</w:t>
+      </w:r>
+      <w:proofErr w:type="spellEnd"/>
+      <w:r>
+        <w:rPr>
+          <w:rFonts w:eastAsia="Times New Roman" w:cs="Times New Roman"/>
+          <w:color w:val="000000"/>
+          <w:kern w:val="0"/>
+          <w:szCs w:val="24"/>
+          <w:lang w:eastAsia="en-ZA"/>
+          <w14:ligatures w14:val="none"/>
+        </w:rPr>
+        <w:t xml:space="preserve"> (2017).</w:t>
       </w:r>
     </w:p>
     <w:p>
@@ -8264,13 +8391,26 @@
         <w:t>TypeScript stack</w:t>
       </w:r>
       <w:r>
-        <w:t xml:space="preserve"> (React, NestJS, Node.js, PostgreSQL)</w:t>
+        <w:t xml:space="preserve"> (React, </w:t>
+      </w:r>
+      <w:proofErr w:type="spellStart"/>
+      <w:r>
+        <w:t>NestJS</w:t>
+      </w:r>
+      <w:proofErr w:type="spellEnd"/>
+      <w:r>
+        <w:t>, Node.js, PostgreSQL)</w:t>
       </w:r>
       <w:r>
         <w:t xml:space="preserve">: This uses react for user interface and frontend in general, with </w:t>
       </w:r>
-      <w:r>
-        <w:t>NestJS/Node.js for the backend. It allows for end-to-end TypeScript with a structured and modular buildout.</w:t>
+      <w:proofErr w:type="spellStart"/>
+      <w:r>
+        <w:t>NestJS</w:t>
+      </w:r>
+      <w:proofErr w:type="spellEnd"/>
+      <w:r>
+        <w:t>/Node.js for the backend. It allows for end-to-end TypeScript with a structured and modular buildout.</w:t>
       </w:r>
     </w:p>
     <w:p>
@@ -8317,7 +8457,15 @@
         <w:t xml:space="preserve"> support</w:t>
       </w:r>
       <w:r>
-        <w:t>, making it easier to getsulotions for specific problems and many tutorials for help implementing features</w:t>
+        <w:t xml:space="preserve">, making it easier to </w:t>
+      </w:r>
+      <w:proofErr w:type="spellStart"/>
+      <w:r>
+        <w:t>getsulotions</w:t>
+      </w:r>
+      <w:proofErr w:type="spellEnd"/>
+      <w:r>
+        <w:t xml:space="preserve"> for specific problems and many tutorials for help implementing features</w:t>
       </w:r>
       <w:r>
         <w:t>.</w:t>
@@ -8396,7 +8544,15 @@
           </w:tcPr>
           <w:p>
             <w:r>
-              <w:t>One TypeScript language across client and server reduces context switching. NestJS supplies a modular structure, but its Node package ecosystem still require</w:t>
+              <w:t xml:space="preserve">One TypeScript language across client and server reduces context switching. </w:t>
+            </w:r>
+            <w:proofErr w:type="spellStart"/>
+            <w:r>
+              <w:t>NestJS</w:t>
+            </w:r>
+            <w:proofErr w:type="spellEnd"/>
+            <w:r>
+              <w:t xml:space="preserve"> supplies a modular structure, but its Node package ecosystem still require</w:t>
             </w:r>
             <w:r>
               <w:t>s some research</w:t>
@@ -8485,7 +8641,6 @@
                 <w:id w:val="-2050982530"/>
                 <w:citation/>
               </w:sdtPr>
-              <w:sdtEndPr/>
               <w:sdtContent>
                 <w:r>
                   <w:fldChar w:fldCharType="begin"/>
@@ -8494,7 +8649,7 @@
                   <w:rPr>
                     <w:lang w:val="en-US"/>
                   </w:rPr>
-                  <w:instrText xml:space="preserve"> CITATION Spr26 \l 1033 </w:instrText>
+                  <w:instrText xml:space="preserve">CITATION Spr26 \l 1033 </w:instrText>
                 </w:r>
                 <w:r>
                   <w:fldChar w:fldCharType="separate"/>
@@ -8534,8 +8689,13 @@
             <w:tcW w:w="3005" w:type="dxa"/>
           </w:tcPr>
           <w:p>
-            <w:r>
-              <w:t>NestJS promotes modular, loosely coupled and testable applications</w:t>
+            <w:proofErr w:type="spellStart"/>
+            <w:r>
+              <w:t>NestJS</w:t>
+            </w:r>
+            <w:proofErr w:type="spellEnd"/>
+            <w:r>
+              <w:t xml:space="preserve"> promotes modular, loosely coupled and testable applications</w:t>
             </w:r>
             <w:r>
               <w:t xml:space="preserve">. </w:t>
@@ -8560,7 +8720,6 @@
                 <w:id w:val="1791781642"/>
                 <w:citation/>
               </w:sdtPr>
-              <w:sdtEndPr/>
               <w:sdtContent>
                 <w:r>
                   <w:fldChar w:fldCharType="begin"/>
@@ -8569,7 +8728,7 @@
                   <w:rPr>
                     <w:lang w:val="en-US"/>
                   </w:rPr>
-                  <w:instrText xml:space="preserve"> CITATION Nes26 \l 1033 </w:instrText>
+                  <w:instrText xml:space="preserve">CITATION Nes26 \l 1033 </w:instrText>
                 </w:r>
                 <w:r>
                   <w:fldChar w:fldCharType="separate"/>
@@ -8619,7 +8778,6 @@
                 <w:id w:val="85583976"/>
                 <w:citation/>
               </w:sdtPr>
-              <w:sdtEndPr/>
               <w:sdtContent>
                 <w:r>
                   <w:fldChar w:fldCharType="begin"/>
@@ -8628,7 +8786,7 @@
                   <w:rPr>
                     <w:lang w:val="en-US"/>
                   </w:rPr>
-                  <w:instrText xml:space="preserve"> CITATION Spr26 \l 1033 </w:instrText>
+                  <w:instrText xml:space="preserve">CITATION Spr26 \l 1033 </w:instrText>
                 </w:r>
                 <w:r>
                   <w:fldChar w:fldCharType="separate"/>
@@ -8678,7 +8836,6 @@
                 <w:id w:val="-925338458"/>
                 <w:citation/>
               </w:sdtPr>
-              <w:sdtEndPr/>
               <w:sdtContent>
                 <w:r>
                   <w:fldChar w:fldCharType="begin"/>
@@ -8687,7 +8844,7 @@
                   <w:rPr>
                     <w:lang w:val="en-US"/>
                   </w:rPr>
-                  <w:instrText xml:space="preserve"> CITATION Nes26 \l 1033 </w:instrText>
+                  <w:instrText xml:space="preserve">CITATION Nes26 \l 1033 </w:instrText>
                 </w:r>
                 <w:r>
                   <w:fldChar w:fldCharType="separate"/>
@@ -8820,7 +8977,6 @@
                 <w:id w:val="71164170"/>
                 <w:citation/>
               </w:sdtPr>
-              <w:sdtEndPr/>
               <w:sdtContent>
                 <w:r>
                   <w:fldChar w:fldCharType="begin"/>
@@ -8829,7 +8985,7 @@
                   <w:rPr>
                     <w:lang w:val="en-US"/>
                   </w:rPr>
-                  <w:instrText xml:space="preserve"> CITATION Spr26 \l 1033 </w:instrText>
+                  <w:instrText xml:space="preserve">CITATION Spr26 \l 1033 </w:instrText>
                 </w:r>
                 <w:r>
                   <w:fldChar w:fldCharType="separate"/>
@@ -9861,7 +10017,6 @@
           <w:id w:val="-150912195"/>
           <w:citation/>
         </w:sdtPr>
-        <w:sdtEndPr/>
         <w:sdtContent>
           <w:r>
             <w:fldChar w:fldCharType="begin"/>
@@ -10101,7 +10256,6 @@
                 <w:id w:val="1664581365"/>
                 <w:citation/>
               </w:sdtPr>
-              <w:sdtEndPr/>
               <w:sdtContent>
                 <w:r>
                   <w:fldChar w:fldCharType="begin"/>
@@ -10180,7 +10334,6 @@
                 <w:id w:val="-1283253055"/>
                 <w:citation/>
               </w:sdtPr>
-              <w:sdtEndPr/>
               <w:sdtContent>
                 <w:r>
                   <w:fldChar w:fldCharType="begin"/>
@@ -10249,7 +10402,6 @@
                 <w:id w:val="1424603490"/>
                 <w:citation/>
               </w:sdtPr>
-              <w:sdtEndPr/>
               <w:sdtContent>
                 <w:r>
                   <w:fldChar w:fldCharType="begin"/>
@@ -10501,7 +10653,6 @@
           <w:docPartUnique/>
         </w:docPartObj>
       </w:sdtPr>
-      <w:sdtEndPr/>
       <w:sdtContent>
         <w:p>
           <w:pPr>
@@ -10517,7 +10668,6 @@
             <w:id w:val="-573587230"/>
             <w:bibliography/>
           </w:sdtPr>
-          <w:sdtEndPr/>
           <w:sdtContent>
             <w:p>
               <w:pPr>
@@ -10661,7 +10811,7 @@
                   <w:noProof/>
                 </w:rPr>
                 <w:br/>
-                <w:t>[Accessed 3 August 2026].</w:t>
+                <w:t>[Accessed 3 September 2026].</w:t>
               </w:r>
             </w:p>
             <w:p>
@@ -10710,7 +10860,7 @@
                   <w:noProof/>
                 </w:rPr>
                 <w:br/>
-                <w:t>[Accessed 3 August 2026].</w:t>
+                <w:t>[Accessed 3 September 2026].</w:t>
               </w:r>
             </w:p>
             <w:p>
@@ -11128,7 +11278,6 @@
               <w:dataBinding w:prefixMappings="xmlns:ns0='http://purl.org/dc/elements/1.1/' xmlns:ns1='http://schemas.openxmlformats.org/package/2006/metadata/core-properties' " w:xpath="/ns1:coreProperties[1]/ns0:subject[1]" w:storeItemID="{6C3C8BC8-F283-45AE-878A-BAB7291924A1}"/>
               <w:text/>
             </w:sdtPr>
-            <w:sdtEndPr/>
             <w:sdtContent>
               <w:r>
                 <w:t>SEN381</w:t>
@@ -11157,7 +11306,6 @@
           <w:dataBinding w:prefixMappings="xmlns:ns0='http://purl.org/dc/elements/1.1/' xmlns:ns1='http://schemas.openxmlformats.org/package/2006/metadata/core-properties' " w:xpath="/ns1:coreProperties[1]/ns0:creator[1]" w:storeItemID="{6C3C8BC8-F283-45AE-878A-BAB7291924A1}"/>
           <w:text/>
         </w:sdtPr>
-        <w:sdtEndPr/>
         <w:sdtContent>
           <w:tc>
             <w:tcPr>
@@ -11170,7 +11318,23 @@
                 <w:jc w:val="center"/>
               </w:pPr>
               <w:r>
-                <w:t>Gerald Enright 577830 | Keletso Marota 601632  | Mogau Malope 600192</w:t>
+                <w:t xml:space="preserve">Gerald Enright 577830 | Keletso </w:t>
+              </w:r>
+              <w:proofErr w:type="spellStart"/>
+              <w:r>
+                <w:t>Marota</w:t>
+              </w:r>
+              <w:proofErr w:type="spellEnd"/>
+              <w:r>
+                <w:t xml:space="preserve"> </w:t>
+              </w:r>
+              <w:proofErr w:type="gramStart"/>
+              <w:r>
+                <w:t>601632  |</w:t>
+              </w:r>
+              <w:proofErr w:type="gramEnd"/>
+              <w:r>
+                <w:t xml:space="preserve"> Mogau Malope 600192</w:t>
               </w:r>
             </w:p>
           </w:tc>
@@ -12944,6 +13108,20 @@
     <w:pitch w:val="variable"/>
     <w:sig w:usb0="E00006FF" w:usb1="420024FF" w:usb2="02000000" w:usb3="00000000" w:csb0="0000019F" w:csb1="00000000"/>
   </w:font>
+  <w:font w:name="Calibri">
+    <w:panose1 w:val="020F0502020204030204"/>
+    <w:charset w:val="00"/>
+    <w:family w:val="swiss"/>
+    <w:pitch w:val="variable"/>
+    <w:sig w:usb0="E4002EFF" w:usb1="C000247B" w:usb2="00000009" w:usb3="00000000" w:csb0="000001FF" w:csb1="00000000"/>
+  </w:font>
+  <w:font w:name="Calibri Light">
+    <w:panose1 w:val="020F0302020204030204"/>
+    <w:charset w:val="00"/>
+    <w:family w:val="swiss"/>
+    <w:pitch w:val="variable"/>
+    <w:sig w:usb0="E4002EFF" w:usb1="C000247B" w:usb2="00000009" w:usb3="00000000" w:csb0="000001FF" w:csb1="00000000"/>
+  </w:font>
 </w:fonts>
 </file>
 
@@ -12965,8 +13143,10 @@
     <w:rsidRoot w:val="00B9532F"/>
     <w:rsid w:val="000F317B"/>
     <w:rsid w:val="003C543F"/>
+    <w:rsid w:val="005022A2"/>
     <w:rsid w:val="005F1D93"/>
     <w:rsid w:val="006049D6"/>
+    <w:rsid w:val="00633C58"/>
     <w:rsid w:val="00707D81"/>
     <w:rsid w:val="00B71680"/>
     <w:rsid w:val="00B9532F"/>
@@ -13829,9 +14009,26 @@
     <b:RefOrder>5</b:RefOrder>
   </b:Source>
   <b:Source>
+    <b:Tag>Nes26</b:Tag>
+    <b:SourceType>InternetSite</b:SourceType>
+    <b:Guid>{2BEEAB87-7148-4204-AA21-EC22188B2BFA}</b:Guid>
+    <b:Title>A progressive Node.js framework</b:Title>
+    <b:Year>2026</b:Year>
+    <b:Author>
+      <b:Author>
+        <b:Corporate>NestJS</b:Corporate>
+      </b:Author>
+    </b:Author>
+    <b:YearAccessed>2026</b:YearAccessed>
+    <b:MonthAccessed>September</b:MonthAccessed>
+    <b:DayAccessed>3</b:DayAccessed>
+    <b:URL>https://docs.nestjs.com</b:URL>
+    <b:RefOrder>4</b:RefOrder>
+  </b:Source>
+  <b:Source>
     <b:Tag>Spr26</b:Tag>
     <b:SourceType>InternetSite</b:SourceType>
-    <b:Guid>{A2A55449-E624-43DE-8EAB-EF4F4D7AA8ED}</b:Guid>
+    <b:Guid>{6490BB74-BE7B-4288-BAA9-640FB10682C1}</b:Guid>
     <b:Author>
       <b:Author>
         <b:Corporate>Spring</b:Corporate>
@@ -13840,33 +14037,16 @@
     <b:Title>Spring boot</b:Title>
     <b:Year>2026</b:Year>
     <b:YearAccessed>2026</b:YearAccessed>
-    <b:MonthAccessed>August</b:MonthAccessed>
+    <b:MonthAccessed>September</b:MonthAccessed>
     <b:DayAccessed>3</b:DayAccessed>
     <b:URL>https://docs.spring.io/spring-boot/index.html</b:URL>
     <b:RefOrder>3</b:RefOrder>
-  </b:Source>
-  <b:Source>
-    <b:Tag>Nes26</b:Tag>
-    <b:SourceType>InternetSite</b:SourceType>
-    <b:Guid>{890C93F3-FD29-43EA-8548-98131823BBEA}</b:Guid>
-    <b:Title>A progressive Node.js framework</b:Title>
-    <b:Year>2026</b:Year>
-    <b:Author>
-      <b:Author>
-        <b:Corporate>NestJS</b:Corporate>
-      </b:Author>
-    </b:Author>
-    <b:YearAccessed>2026</b:YearAccessed>
-    <b:MonthAccessed>August</b:MonthAccessed>
-    <b:DayAccessed>3</b:DayAccessed>
-    <b:URL>https://docs.nestjs.com</b:URL>
-    <b:RefOrder>4</b:RefOrder>
   </b:Source>
 </b:Sources>
 </file>
 
 <file path=customXml/itemProps1.xml><?xml version="1.0" encoding="utf-8"?>
-<ds:datastoreItem xmlns:ds="http://schemas.openxmlformats.org/officeDocument/2006/customXml" ds:itemID="{E4B51861-F8FE-4DE9-BCFD-5BC3C7E39C73}">
+<ds:datastoreItem xmlns:ds="http://schemas.openxmlformats.org/officeDocument/2006/customXml" ds:itemID="{A04A1F10-4AED-4FD6-919A-390FD696046D}">
   <ds:schemaRefs>
     <ds:schemaRef ds:uri="http://schemas.openxmlformats.org/officeDocument/2006/bibliography"/>
   </ds:schemaRefs>

</xml_diff>